<commit_message>
LASSO regularisation is added
</commit_message>
<xml_diff>
--- a/Text/ВКР Давыдов Никита Анатольевич.docx
+++ b/Text/ВКР Давыдов Никита Анатольевич.docx
@@ -765,6 +765,7 @@
           <w:docPartUnique/>
         </w:docPartObj>
       </w:sdtPr>
+      <w:sdtEndPr/>
       <w:sdtContent>
         <w:p>
           <w:pPr>
@@ -6865,8 +6866,6 @@
         </w:rPr>
         <w:t>]</w:t>
       </w:r>
-      <w:bookmarkStart w:id="11" w:name="_GoBack"/>
-      <w:bookmarkEnd w:id="11"/>
     </w:p>
     <w:p>
       <w:pPr>
@@ -12691,13 +12690,7 @@
       </w:r>
       <w:proofErr w:type="spellEnd"/>
       <w:r>
-        <w:t>. (</w:t>
-      </w:r>
-      <w:r>
-        <w:t>5600</w:t>
-      </w:r>
-      <w:r>
-        <w:t>, 20)</w:t>
+        <w:t>. (5600, 20)</w:t>
       </w:r>
     </w:p>
     <w:tbl>
@@ -13499,10 +13492,7 @@
       </w:r>
       <w:proofErr w:type="spellEnd"/>
       <w:r>
-        <w:t>. (5600</w:t>
-      </w:r>
-      <w:r>
-        <w:t xml:space="preserve">, </w:t>
+        <w:t xml:space="preserve">. (5600, </w:t>
       </w:r>
       <w:r>
         <w:rPr>
@@ -14283,13 +14273,7 @@
         <w:t xml:space="preserve">ручной выбор </w:t>
       </w:r>
       <w:r>
-        <w:t>1</w:t>
-      </w:r>
-      <w:r>
-        <w:t>0</w:t>
-      </w:r>
-      <w:r>
-        <w:t xml:space="preserve"> </w:t>
+        <w:t xml:space="preserve">10 </w:t>
       </w:r>
       <w:r>
         <w:t xml:space="preserve">используемых </w:t>
@@ -15021,6 +15005,925 @@
     </w:p>
     <w:p>
       <w:pPr>
+        <w:pStyle w:val="afe"/>
+        <w:rPr>
+          <w:lang w:val="en-US"/>
+        </w:rPr>
+      </w:pPr>
+      <w:r>
+        <w:rPr>
+          <w:b/>
+          <w:u w:val="single"/>
+        </w:rPr>
+        <w:t>Второй</w:t>
+      </w:r>
+      <w:r>
+        <w:rPr>
+          <w:b/>
+          <w:u w:val="single"/>
+        </w:rPr>
+        <w:t xml:space="preserve"> </w:t>
+      </w:r>
+      <w:proofErr w:type="spellStart"/>
+      <w:r>
+        <w:rPr>
+          <w:b/>
+          <w:u w:val="single"/>
+        </w:rPr>
+        <w:t>датасет</w:t>
+      </w:r>
+      <w:proofErr w:type="spellEnd"/>
+      <w:r>
+        <w:t xml:space="preserve">. </w:t>
+      </w:r>
+      <w:r>
+        <w:rPr>
+          <w:lang w:val="en-US"/>
+        </w:rPr>
+        <w:t>Test</w:t>
+      </w:r>
+      <w:r>
+        <w:t>/</w:t>
+      </w:r>
+      <w:r>
+        <w:rPr>
+          <w:lang w:val="en-US"/>
+        </w:rPr>
+        <w:t>train</w:t>
+      </w:r>
+      <w:r>
+        <w:t xml:space="preserve"> </w:t>
+      </w:r>
+      <w:r>
+        <w:rPr>
+          <w:lang w:val="en-US"/>
+        </w:rPr>
+        <w:t>split</w:t>
+      </w:r>
+      <w:r>
+        <w:t xml:space="preserve">, </w:t>
+      </w:r>
+      <w:r>
+        <w:t>без</w:t>
+      </w:r>
+      <w:r>
+        <w:t xml:space="preserve"> </w:t>
+      </w:r>
+      <w:proofErr w:type="spellStart"/>
+      <w:r>
+        <w:t>эмбеддингов</w:t>
+      </w:r>
+      <w:proofErr w:type="spellEnd"/>
+      <w:r>
+        <w:t xml:space="preserve">, </w:t>
+      </w:r>
+      <w:r>
+        <w:t>без</w:t>
+      </w:r>
+      <w:r>
+        <w:t xml:space="preserve"> </w:t>
+      </w:r>
+      <w:r>
+        <w:t>аугментации</w:t>
+      </w:r>
+      <w:r>
+        <w:t xml:space="preserve"> </w:t>
+      </w:r>
+      <w:r>
+        <w:t>данных</w:t>
+      </w:r>
+      <w:r>
+        <w:t xml:space="preserve">, </w:t>
+      </w:r>
+      <w:proofErr w:type="spellStart"/>
+      <w:r>
+        <w:t>клиппинг</w:t>
+      </w:r>
+      <w:proofErr w:type="spellEnd"/>
+      <w:r>
+        <w:t xml:space="preserve"> </w:t>
+      </w:r>
+      <w:r>
+        <w:t>при</w:t>
+      </w:r>
+      <w:r>
+        <w:t xml:space="preserve"> </w:t>
+      </w:r>
+      <w:r>
+        <w:t>удалении</w:t>
+      </w:r>
+      <w:r>
+        <w:t xml:space="preserve"> </w:t>
+      </w:r>
+      <w:r>
+        <w:t>выбросов</w:t>
+      </w:r>
+      <w:r>
+        <w:t xml:space="preserve">, </w:t>
+      </w:r>
+      <w:r>
+        <w:t>стратификация</w:t>
+      </w:r>
+      <w:r>
+        <w:t xml:space="preserve"> </w:t>
+      </w:r>
+      <w:r>
+        <w:t>при</w:t>
+      </w:r>
+      <w:r>
+        <w:t xml:space="preserve"> </w:t>
+      </w:r>
+      <w:r>
+        <w:t>сплите</w:t>
+      </w:r>
+      <w:r>
+        <w:t xml:space="preserve">, </w:t>
+      </w:r>
+      <w:r>
+        <w:t>выбор</w:t>
+      </w:r>
+      <w:r>
+        <w:t xml:space="preserve"> </w:t>
+      </w:r>
+      <w:proofErr w:type="spellStart"/>
+      <w:r>
+        <w:t>фич</w:t>
+      </w:r>
+      <w:proofErr w:type="spellEnd"/>
+      <w:r>
+        <w:t xml:space="preserve"> </w:t>
+      </w:r>
+      <w:r>
+        <w:t>по</w:t>
+      </w:r>
+      <w:r>
+        <w:t xml:space="preserve"> </w:t>
+      </w:r>
+      <w:r>
+        <w:t>порогу</w:t>
+      </w:r>
+      <w:r>
+        <w:t xml:space="preserve"> </w:t>
+      </w:r>
+      <w:r>
+        <w:t>корреляции</w:t>
+      </w:r>
+      <w:r>
+        <w:t xml:space="preserve"> (0.95), </w:t>
+      </w:r>
+      <w:r>
+        <w:t>без</w:t>
+      </w:r>
+      <w:r>
+        <w:t xml:space="preserve"> </w:t>
+      </w:r>
+      <w:proofErr w:type="spellStart"/>
+      <w:r>
+        <w:t>гиперпараметров</w:t>
+      </w:r>
+      <w:proofErr w:type="spellEnd"/>
+      <w:r>
+        <w:t xml:space="preserve">. </w:t>
+      </w:r>
+      <w:r>
+        <w:rPr>
+          <w:lang w:val="en-US"/>
+        </w:rPr>
+        <w:t>(</w:t>
+      </w:r>
+      <w:r>
+        <w:rPr>
+          <w:lang w:val="en-US"/>
+        </w:rPr>
+        <w:t>289</w:t>
+      </w:r>
+      <w:r>
+        <w:rPr>
+          <w:lang w:val="en-US"/>
+        </w:rPr>
+        <w:t xml:space="preserve">, </w:t>
+      </w:r>
+      <w:r>
+        <w:rPr>
+          <w:lang w:val="en-US"/>
+        </w:rPr>
+        <w:t>44</w:t>
+      </w:r>
+      <w:r>
+        <w:rPr>
+          <w:lang w:val="en-US"/>
+        </w:rPr>
+        <w:t>)</w:t>
+      </w:r>
+    </w:p>
+    <w:tbl>
+      <w:tblPr>
+        <w:tblStyle w:val="af3"/>
+        <w:tblW w:w="0" w:type="auto"/>
+        <w:tblLook w:val="04A0" w:firstRow="1" w:lastRow="0" w:firstColumn="1" w:lastColumn="0" w:noHBand="0" w:noVBand="1"/>
+      </w:tblPr>
+      <w:tblGrid>
+        <w:gridCol w:w="1316"/>
+        <w:gridCol w:w="1265"/>
+        <w:gridCol w:w="1203"/>
+        <w:gridCol w:w="1198"/>
+        <w:gridCol w:w="1298"/>
+        <w:gridCol w:w="1234"/>
+        <w:gridCol w:w="1141"/>
+        <w:gridCol w:w="1199"/>
+      </w:tblGrid>
+      <w:tr>
+        <w:tc>
+          <w:tcPr>
+            <w:tcW w:w="1316" w:type="dxa"/>
+          </w:tcPr>
+          <w:p>
+            <w:pPr>
+              <w:pStyle w:val="afe"/>
+              <w:ind w:firstLine="0"/>
+              <w:rPr>
+                <w:lang w:val="en-US"/>
+              </w:rPr>
+            </w:pPr>
+            <w:r>
+              <w:t>Модель</w:t>
+            </w:r>
+          </w:p>
+        </w:tc>
+        <w:tc>
+          <w:tcPr>
+            <w:tcW w:w="1265" w:type="dxa"/>
+          </w:tcPr>
+          <w:p>
+            <w:pPr>
+              <w:pStyle w:val="afe"/>
+              <w:ind w:firstLine="0"/>
+              <w:rPr>
+                <w:lang w:val="en-US"/>
+              </w:rPr>
+            </w:pPr>
+            <w:r>
+              <w:rPr>
+                <w:lang w:val="en-US"/>
+              </w:rPr>
+              <w:t>Linear</w:t>
+            </w:r>
+          </w:p>
+        </w:tc>
+        <w:tc>
+          <w:tcPr>
+            <w:tcW w:w="1203" w:type="dxa"/>
+          </w:tcPr>
+          <w:p>
+            <w:pPr>
+              <w:pStyle w:val="afe"/>
+              <w:ind w:firstLine="0"/>
+              <w:rPr>
+                <w:lang w:val="en-US"/>
+              </w:rPr>
+            </w:pPr>
+            <w:r>
+              <w:rPr>
+                <w:lang w:val="en-US"/>
+              </w:rPr>
+              <w:t>DT</w:t>
+            </w:r>
+          </w:p>
+        </w:tc>
+        <w:tc>
+          <w:tcPr>
+            <w:tcW w:w="1198" w:type="dxa"/>
+          </w:tcPr>
+          <w:p>
+            <w:pPr>
+              <w:pStyle w:val="afe"/>
+              <w:ind w:firstLine="0"/>
+              <w:rPr>
+                <w:lang w:val="en-US"/>
+              </w:rPr>
+            </w:pPr>
+            <w:r>
+              <w:rPr>
+                <w:lang w:val="en-US"/>
+              </w:rPr>
+              <w:t>RF</w:t>
+            </w:r>
+          </w:p>
+        </w:tc>
+        <w:tc>
+          <w:tcPr>
+            <w:tcW w:w="1298" w:type="dxa"/>
+          </w:tcPr>
+          <w:p>
+            <w:pPr>
+              <w:pStyle w:val="afe"/>
+              <w:ind w:firstLine="0"/>
+              <w:rPr>
+                <w:lang w:val="en-US"/>
+              </w:rPr>
+            </w:pPr>
+            <w:proofErr w:type="spellStart"/>
+            <w:r>
+              <w:rPr>
+                <w:lang w:val="en-US"/>
+              </w:rPr>
+              <w:t>GBoost</w:t>
+            </w:r>
+            <w:proofErr w:type="spellEnd"/>
+          </w:p>
+        </w:tc>
+        <w:tc>
+          <w:tcPr>
+            <w:tcW w:w="1234" w:type="dxa"/>
+          </w:tcPr>
+          <w:p>
+            <w:pPr>
+              <w:pStyle w:val="afe"/>
+              <w:ind w:firstLine="0"/>
+              <w:rPr>
+                <w:lang w:val="en-US"/>
+              </w:rPr>
+            </w:pPr>
+            <w:r>
+              <w:rPr>
+                <w:lang w:val="en-US"/>
+              </w:rPr>
+              <w:t>KNN</w:t>
+            </w:r>
+          </w:p>
+        </w:tc>
+        <w:tc>
+          <w:tcPr>
+            <w:tcW w:w="1141" w:type="dxa"/>
+          </w:tcPr>
+          <w:p>
+            <w:pPr>
+              <w:pStyle w:val="afe"/>
+              <w:ind w:firstLine="0"/>
+              <w:rPr>
+                <w:lang w:val="en-US"/>
+              </w:rPr>
+            </w:pPr>
+            <w:proofErr w:type="spellStart"/>
+            <w:r>
+              <w:rPr>
+                <w:lang w:val="en-US"/>
+              </w:rPr>
+              <w:t>Catboost</w:t>
+            </w:r>
+            <w:proofErr w:type="spellEnd"/>
+          </w:p>
+        </w:tc>
+        <w:tc>
+          <w:tcPr>
+            <w:tcW w:w="1199" w:type="dxa"/>
+          </w:tcPr>
+          <w:p>
+            <w:pPr>
+              <w:pStyle w:val="afe"/>
+              <w:ind w:firstLine="0"/>
+              <w:rPr>
+                <w:lang w:val="en-US"/>
+              </w:rPr>
+            </w:pPr>
+            <w:proofErr w:type="spellStart"/>
+            <w:r>
+              <w:rPr>
+                <w:lang w:val="en-US"/>
+              </w:rPr>
+              <w:t>XGBoost</w:t>
+            </w:r>
+            <w:proofErr w:type="spellEnd"/>
+          </w:p>
+        </w:tc>
+      </w:tr>
+      <w:tr>
+        <w:tc>
+          <w:tcPr>
+            <w:tcW w:w="1316" w:type="dxa"/>
+          </w:tcPr>
+          <w:p>
+            <w:pPr>
+              <w:pStyle w:val="afe"/>
+              <w:ind w:firstLine="0"/>
+              <w:rPr>
+                <w:lang w:val="en-US"/>
+              </w:rPr>
+            </w:pPr>
+            <w:r>
+              <w:rPr>
+                <w:lang w:val="en-US"/>
+              </w:rPr>
+              <w:lastRenderedPageBreak/>
+              <w:t>R</w:t>
+            </w:r>
+            <w:r>
+              <w:rPr>
+                <w:vertAlign w:val="superscript"/>
+                <w:lang w:val="en-US"/>
+              </w:rPr>
+              <w:t>2</w:t>
+            </w:r>
+            <w:r>
+              <w:rPr>
+                <w:lang w:val="en-US"/>
+              </w:rPr>
+              <w:t xml:space="preserve"> (t</w:t>
+            </w:r>
+            <w:r>
+              <w:rPr>
+                <w:lang w:val="en-US"/>
+              </w:rPr>
+              <w:t>rain</w:t>
+            </w:r>
+            <w:r>
+              <w:rPr>
+                <w:lang w:val="en-US"/>
+              </w:rPr>
+              <w:t>)</w:t>
+            </w:r>
+          </w:p>
+        </w:tc>
+        <w:tc>
+          <w:tcPr>
+            <w:tcW w:w="1265" w:type="dxa"/>
+          </w:tcPr>
+          <w:p>
+            <w:pPr>
+              <w:pStyle w:val="afe"/>
+              <w:ind w:firstLine="0"/>
+              <w:rPr>
+                <w:lang w:val="en-US"/>
+              </w:rPr>
+            </w:pPr>
+            <w:r>
+              <w:rPr>
+                <w:lang w:val="en-US"/>
+              </w:rPr>
+              <w:t>0.64</w:t>
+            </w:r>
+          </w:p>
+        </w:tc>
+        <w:tc>
+          <w:tcPr>
+            <w:tcW w:w="1203" w:type="dxa"/>
+          </w:tcPr>
+          <w:p>
+            <w:pPr>
+              <w:pStyle w:val="afe"/>
+              <w:ind w:firstLine="0"/>
+              <w:rPr>
+                <w:lang w:val="en-US"/>
+              </w:rPr>
+            </w:pPr>
+            <w:r>
+              <w:rPr>
+                <w:lang w:val="en-US"/>
+              </w:rPr>
+              <w:t>0.99</w:t>
+            </w:r>
+          </w:p>
+        </w:tc>
+        <w:tc>
+          <w:tcPr>
+            <w:tcW w:w="1198" w:type="dxa"/>
+          </w:tcPr>
+          <w:p>
+            <w:pPr>
+              <w:pStyle w:val="afe"/>
+              <w:ind w:firstLine="0"/>
+              <w:rPr>
+                <w:lang w:val="en-US"/>
+              </w:rPr>
+            </w:pPr>
+            <w:r>
+              <w:rPr>
+                <w:lang w:val="en-US"/>
+              </w:rPr>
+              <w:t>0.65</w:t>
+            </w:r>
+          </w:p>
+        </w:tc>
+        <w:tc>
+          <w:tcPr>
+            <w:tcW w:w="1298" w:type="dxa"/>
+          </w:tcPr>
+          <w:p>
+            <w:pPr>
+              <w:pStyle w:val="afe"/>
+              <w:ind w:firstLine="0"/>
+              <w:rPr>
+                <w:lang w:val="en-US"/>
+              </w:rPr>
+            </w:pPr>
+            <w:r>
+              <w:rPr>
+                <w:lang w:val="en-US"/>
+              </w:rPr>
+              <w:t>0.96</w:t>
+            </w:r>
+          </w:p>
+        </w:tc>
+        <w:tc>
+          <w:tcPr>
+            <w:tcW w:w="1234" w:type="dxa"/>
+          </w:tcPr>
+          <w:p>
+            <w:pPr>
+              <w:pStyle w:val="afe"/>
+              <w:ind w:firstLine="0"/>
+              <w:rPr>
+                <w:lang w:val="en-US"/>
+              </w:rPr>
+            </w:pPr>
+            <w:r>
+              <w:rPr>
+                <w:lang w:val="en-US"/>
+              </w:rPr>
+              <w:t>0.48</w:t>
+            </w:r>
+          </w:p>
+        </w:tc>
+        <w:tc>
+          <w:tcPr>
+            <w:tcW w:w="1141" w:type="dxa"/>
+          </w:tcPr>
+          <w:p>
+            <w:pPr>
+              <w:pStyle w:val="afe"/>
+              <w:ind w:firstLine="0"/>
+              <w:rPr>
+                <w:lang w:val="en-US"/>
+              </w:rPr>
+            </w:pPr>
+            <w:r>
+              <w:rPr>
+                <w:lang w:val="en-US"/>
+              </w:rPr>
+              <w:t>0.98</w:t>
+            </w:r>
+          </w:p>
+        </w:tc>
+        <w:tc>
+          <w:tcPr>
+            <w:tcW w:w="1199" w:type="dxa"/>
+          </w:tcPr>
+          <w:p>
+            <w:pPr>
+              <w:pStyle w:val="afe"/>
+              <w:ind w:firstLine="0"/>
+              <w:rPr>
+                <w:lang w:val="en-US"/>
+              </w:rPr>
+            </w:pPr>
+            <w:r>
+              <w:rPr>
+                <w:lang w:val="en-US"/>
+              </w:rPr>
+              <w:t>0.97</w:t>
+            </w:r>
+          </w:p>
+        </w:tc>
+      </w:tr>
+      <w:tr>
+        <w:tc>
+          <w:tcPr>
+            <w:tcW w:w="1316" w:type="dxa"/>
+          </w:tcPr>
+          <w:p>
+            <w:pPr>
+              <w:pStyle w:val="afe"/>
+              <w:ind w:firstLine="0"/>
+              <w:rPr>
+                <w:lang w:val="en-US"/>
+              </w:rPr>
+            </w:pPr>
+            <w:r>
+              <w:rPr>
+                <w:lang w:val="en-US"/>
+              </w:rPr>
+              <w:t>R</w:t>
+            </w:r>
+            <w:r>
+              <w:rPr>
+                <w:vertAlign w:val="superscript"/>
+              </w:rPr>
+              <w:t>2</w:t>
+            </w:r>
+            <w:r>
+              <w:rPr>
+                <w:lang w:val="en-US"/>
+              </w:rPr>
+              <w:t xml:space="preserve"> (test)</w:t>
+            </w:r>
+          </w:p>
+        </w:tc>
+        <w:tc>
+          <w:tcPr>
+            <w:tcW w:w="1265" w:type="dxa"/>
+          </w:tcPr>
+          <w:p>
+            <w:pPr>
+              <w:pStyle w:val="afe"/>
+              <w:ind w:firstLine="0"/>
+              <w:rPr>
+                <w:lang w:val="en-US"/>
+              </w:rPr>
+            </w:pPr>
+            <w:r>
+              <w:rPr>
+                <w:lang w:val="en-US"/>
+              </w:rPr>
+              <w:t>0.26</w:t>
+            </w:r>
+          </w:p>
+        </w:tc>
+        <w:tc>
+          <w:tcPr>
+            <w:tcW w:w="1203" w:type="dxa"/>
+          </w:tcPr>
+          <w:p>
+            <w:pPr>
+              <w:pStyle w:val="afe"/>
+              <w:ind w:firstLine="0"/>
+              <w:rPr>
+                <w:lang w:val="en-US"/>
+              </w:rPr>
+            </w:pPr>
+            <w:r>
+              <w:rPr>
+                <w:lang w:val="en-US"/>
+              </w:rPr>
+              <w:t>0.32</w:t>
+            </w:r>
+          </w:p>
+        </w:tc>
+        <w:tc>
+          <w:tcPr>
+            <w:tcW w:w="1198" w:type="dxa"/>
+          </w:tcPr>
+          <w:p>
+            <w:pPr>
+              <w:pStyle w:val="afe"/>
+              <w:ind w:firstLine="0"/>
+              <w:rPr>
+                <w:lang w:val="en-US"/>
+              </w:rPr>
+            </w:pPr>
+            <w:r>
+              <w:rPr>
+                <w:lang w:val="en-US"/>
+              </w:rPr>
+              <w:t>0.33</w:t>
+            </w:r>
+          </w:p>
+        </w:tc>
+        <w:tc>
+          <w:tcPr>
+            <w:tcW w:w="1298" w:type="dxa"/>
+          </w:tcPr>
+          <w:p>
+            <w:pPr>
+              <w:pStyle w:val="afe"/>
+              <w:ind w:firstLine="0"/>
+              <w:rPr>
+                <w:lang w:val="en-US"/>
+              </w:rPr>
+            </w:pPr>
+            <w:r>
+              <w:rPr>
+                <w:lang w:val="en-US"/>
+              </w:rPr>
+              <w:t>0.51</w:t>
+            </w:r>
+          </w:p>
+        </w:tc>
+        <w:tc>
+          <w:tcPr>
+            <w:tcW w:w="1234" w:type="dxa"/>
+          </w:tcPr>
+          <w:p>
+            <w:pPr>
+              <w:pStyle w:val="afe"/>
+              <w:ind w:firstLine="0"/>
+              <w:rPr>
+                <w:lang w:val="en-US"/>
+              </w:rPr>
+            </w:pPr>
+            <w:r>
+              <w:rPr>
+                <w:lang w:val="en-US"/>
+              </w:rPr>
+              <w:t>0.30</w:t>
+            </w:r>
+          </w:p>
+        </w:tc>
+        <w:tc>
+          <w:tcPr>
+            <w:tcW w:w="1141" w:type="dxa"/>
+          </w:tcPr>
+          <w:p>
+            <w:pPr>
+              <w:pStyle w:val="afe"/>
+              <w:ind w:firstLine="0"/>
+              <w:rPr>
+                <w:lang w:val="en-US"/>
+              </w:rPr>
+            </w:pPr>
+            <w:r>
+              <w:rPr>
+                <w:lang w:val="en-US"/>
+              </w:rPr>
+              <w:t>0.52</w:t>
+            </w:r>
+          </w:p>
+        </w:tc>
+        <w:tc>
+          <w:tcPr>
+            <w:tcW w:w="1199" w:type="dxa"/>
+          </w:tcPr>
+          <w:p>
+            <w:pPr>
+              <w:pStyle w:val="afe"/>
+              <w:ind w:firstLine="0"/>
+              <w:rPr>
+                <w:lang w:val="en-US"/>
+              </w:rPr>
+            </w:pPr>
+            <w:r>
+              <w:rPr>
+                <w:lang w:val="en-US"/>
+              </w:rPr>
+              <w:t>0.57</w:t>
+            </w:r>
+          </w:p>
+        </w:tc>
+      </w:tr>
+      <w:tr>
+        <w:tc>
+          <w:tcPr>
+            <w:tcW w:w="1316" w:type="dxa"/>
+          </w:tcPr>
+          <w:p>
+            <w:pPr>
+              <w:pStyle w:val="afe"/>
+              <w:ind w:firstLine="0"/>
+              <w:rPr>
+                <w:lang w:val="en-US"/>
+              </w:rPr>
+            </w:pPr>
+            <w:r>
+              <w:rPr>
+                <w:lang w:val="en-US"/>
+              </w:rPr>
+              <w:t>RMSE</w:t>
+            </w:r>
+          </w:p>
+        </w:tc>
+        <w:tc>
+          <w:tcPr>
+            <w:tcW w:w="1265" w:type="dxa"/>
+          </w:tcPr>
+          <w:p>
+            <w:pPr>
+              <w:pStyle w:val="afe"/>
+              <w:ind w:firstLine="0"/>
+              <w:rPr>
+                <w:lang w:val="en-US"/>
+              </w:rPr>
+            </w:pPr>
+            <w:r>
+              <w:rPr>
+                <w:lang w:val="en-US"/>
+              </w:rPr>
+              <w:t>2.41</w:t>
+            </w:r>
+          </w:p>
+        </w:tc>
+        <w:tc>
+          <w:tcPr>
+            <w:tcW w:w="1203" w:type="dxa"/>
+          </w:tcPr>
+          <w:p>
+            <w:pPr>
+              <w:pStyle w:val="afe"/>
+              <w:ind w:firstLine="0"/>
+              <w:rPr>
+                <w:lang w:val="en-US"/>
+              </w:rPr>
+            </w:pPr>
+            <w:r>
+              <w:rPr>
+                <w:lang w:val="en-US"/>
+              </w:rPr>
+              <w:t>2.31</w:t>
+            </w:r>
+          </w:p>
+        </w:tc>
+        <w:tc>
+          <w:tcPr>
+            <w:tcW w:w="1198" w:type="dxa"/>
+          </w:tcPr>
+          <w:p>
+            <w:pPr>
+              <w:pStyle w:val="afe"/>
+              <w:ind w:firstLine="0"/>
+              <w:rPr>
+                <w:lang w:val="en-US"/>
+              </w:rPr>
+            </w:pPr>
+            <w:r>
+              <w:rPr>
+                <w:lang w:val="en-US"/>
+              </w:rPr>
+              <w:t>2.29</w:t>
+            </w:r>
+          </w:p>
+        </w:tc>
+        <w:tc>
+          <w:tcPr>
+            <w:tcW w:w="1298" w:type="dxa"/>
+          </w:tcPr>
+          <w:p>
+            <w:pPr>
+              <w:pStyle w:val="afe"/>
+              <w:ind w:firstLine="0"/>
+              <w:rPr>
+                <w:lang w:val="en-US"/>
+              </w:rPr>
+            </w:pPr>
+            <w:r>
+              <w:rPr>
+                <w:lang w:val="en-US"/>
+              </w:rPr>
+              <w:t>1.96</w:t>
+            </w:r>
+          </w:p>
+        </w:tc>
+        <w:tc>
+          <w:tcPr>
+            <w:tcW w:w="1234" w:type="dxa"/>
+          </w:tcPr>
+          <w:p>
+            <w:pPr>
+              <w:pStyle w:val="afe"/>
+              <w:ind w:firstLine="0"/>
+              <w:rPr>
+                <w:lang w:val="en-US"/>
+              </w:rPr>
+            </w:pPr>
+            <w:r>
+              <w:rPr>
+                <w:lang w:val="en-US"/>
+              </w:rPr>
+              <w:t>2.35</w:t>
+            </w:r>
+          </w:p>
+        </w:tc>
+        <w:tc>
+          <w:tcPr>
+            <w:tcW w:w="1141" w:type="dxa"/>
+          </w:tcPr>
+          <w:p>
+            <w:pPr>
+              <w:pStyle w:val="afe"/>
+              <w:ind w:firstLine="0"/>
+              <w:rPr>
+                <w:lang w:val="en-US"/>
+              </w:rPr>
+            </w:pPr>
+            <w:r>
+              <w:rPr>
+                <w:lang w:val="en-US"/>
+              </w:rPr>
+              <w:t>1.93</w:t>
+            </w:r>
+          </w:p>
+        </w:tc>
+        <w:tc>
+          <w:tcPr>
+            <w:tcW w:w="1199" w:type="dxa"/>
+          </w:tcPr>
+          <w:p>
+            <w:pPr>
+              <w:pStyle w:val="afe"/>
+              <w:ind w:firstLine="0"/>
+              <w:rPr>
+                <w:lang w:val="en-US"/>
+              </w:rPr>
+            </w:pPr>
+            <w:r>
+              <w:rPr>
+                <w:lang w:val="en-US"/>
+              </w:rPr>
+              <w:t>1.83</w:t>
+            </w:r>
+          </w:p>
+        </w:tc>
+      </w:tr>
+    </w:tbl>
+    <w:p>
+      <w:pPr>
         <w:rPr>
           <w:lang w:val="en-US"/>
         </w:rPr>
@@ -15028,6 +15931,927 @@
     </w:p>
     <w:p>
       <w:pPr>
+        <w:pStyle w:val="afe"/>
+        <w:rPr>
+          <w:lang w:val="en-US"/>
+        </w:rPr>
+      </w:pPr>
+      <w:r>
+        <w:rPr>
+          <w:b/>
+          <w:u w:val="single"/>
+        </w:rPr>
+        <w:t>Объединенный</w:t>
+      </w:r>
+      <w:r>
+        <w:rPr>
+          <w:b/>
+          <w:u w:val="single"/>
+        </w:rPr>
+        <w:t xml:space="preserve"> </w:t>
+      </w:r>
+      <w:proofErr w:type="spellStart"/>
+      <w:r>
+        <w:rPr>
+          <w:b/>
+          <w:u w:val="single"/>
+        </w:rPr>
+        <w:t>датасет</w:t>
+      </w:r>
+      <w:proofErr w:type="spellEnd"/>
+      <w:r>
+        <w:t xml:space="preserve">. </w:t>
+      </w:r>
+      <w:r>
+        <w:rPr>
+          <w:lang w:val="en-US"/>
+        </w:rPr>
+        <w:t>Test</w:t>
+      </w:r>
+      <w:r>
+        <w:t>/</w:t>
+      </w:r>
+      <w:r>
+        <w:rPr>
+          <w:lang w:val="en-US"/>
+        </w:rPr>
+        <w:t>train</w:t>
+      </w:r>
+      <w:r>
+        <w:t xml:space="preserve"> </w:t>
+      </w:r>
+      <w:r>
+        <w:rPr>
+          <w:lang w:val="en-US"/>
+        </w:rPr>
+        <w:t>split</w:t>
+      </w:r>
+      <w:r>
+        <w:t xml:space="preserve">, </w:t>
+      </w:r>
+      <w:r>
+        <w:t>без</w:t>
+      </w:r>
+      <w:r>
+        <w:t xml:space="preserve"> </w:t>
+      </w:r>
+      <w:proofErr w:type="spellStart"/>
+      <w:r>
+        <w:t>эмбеддингов</w:t>
+      </w:r>
+      <w:proofErr w:type="spellEnd"/>
+      <w:r>
+        <w:t xml:space="preserve">, </w:t>
+      </w:r>
+      <w:r>
+        <w:t>без</w:t>
+      </w:r>
+      <w:r>
+        <w:t xml:space="preserve"> </w:t>
+      </w:r>
+      <w:r>
+        <w:t>аугментации</w:t>
+      </w:r>
+      <w:r>
+        <w:t xml:space="preserve"> </w:t>
+      </w:r>
+      <w:r>
+        <w:t>данных</w:t>
+      </w:r>
+      <w:r>
+        <w:t xml:space="preserve">, </w:t>
+      </w:r>
+      <w:proofErr w:type="spellStart"/>
+      <w:r>
+        <w:t>клиппинг</w:t>
+      </w:r>
+      <w:proofErr w:type="spellEnd"/>
+      <w:r>
+        <w:t xml:space="preserve"> </w:t>
+      </w:r>
+      <w:r>
+        <w:t>при</w:t>
+      </w:r>
+      <w:r>
+        <w:t xml:space="preserve"> </w:t>
+      </w:r>
+      <w:r>
+        <w:t>удалении</w:t>
+      </w:r>
+      <w:r>
+        <w:t xml:space="preserve"> </w:t>
+      </w:r>
+      <w:r>
+        <w:t>выбросов</w:t>
+      </w:r>
+      <w:r>
+        <w:t xml:space="preserve">, </w:t>
+      </w:r>
+      <w:r>
+        <w:t>стратификация</w:t>
+      </w:r>
+      <w:r>
+        <w:t xml:space="preserve"> </w:t>
+      </w:r>
+      <w:r>
+        <w:t>при</w:t>
+      </w:r>
+      <w:r>
+        <w:t xml:space="preserve"> </w:t>
+      </w:r>
+      <w:r>
+        <w:t>сплите</w:t>
+      </w:r>
+      <w:r>
+        <w:t xml:space="preserve">, </w:t>
+      </w:r>
+      <w:r>
+        <w:t>выбор</w:t>
+      </w:r>
+      <w:r>
+        <w:t xml:space="preserve"> </w:t>
+      </w:r>
+      <w:proofErr w:type="spellStart"/>
+      <w:r>
+        <w:t>фич</w:t>
+      </w:r>
+      <w:proofErr w:type="spellEnd"/>
+      <w:r>
+        <w:t xml:space="preserve"> </w:t>
+      </w:r>
+      <w:r>
+        <w:t>по</w:t>
+      </w:r>
+      <w:r>
+        <w:t xml:space="preserve"> </w:t>
+      </w:r>
+      <w:r>
+        <w:t>порогу</w:t>
+      </w:r>
+      <w:r>
+        <w:t xml:space="preserve"> </w:t>
+      </w:r>
+      <w:r>
+        <w:t>корреляции</w:t>
+      </w:r>
+      <w:r>
+        <w:t xml:space="preserve"> (0.95), </w:t>
+      </w:r>
+      <w:r>
+        <w:t>без</w:t>
+      </w:r>
+      <w:r>
+        <w:t xml:space="preserve"> </w:t>
+      </w:r>
+      <w:proofErr w:type="spellStart"/>
+      <w:r>
+        <w:t>гиперпараметров</w:t>
+      </w:r>
+      <w:proofErr w:type="spellEnd"/>
+      <w:r>
+        <w:t xml:space="preserve">. </w:t>
+      </w:r>
+      <w:r>
+        <w:rPr>
+          <w:lang w:val="en-US"/>
+        </w:rPr>
+        <w:t>(</w:t>
+      </w:r>
+      <w:r>
+        <w:t>7</w:t>
+      </w:r>
+      <w:r>
+        <w:rPr>
+          <w:lang w:val="en-US"/>
+        </w:rPr>
+        <w:t>89</w:t>
+      </w:r>
+      <w:r>
+        <w:rPr>
+          <w:lang w:val="en-US"/>
+        </w:rPr>
+        <w:t xml:space="preserve">, </w:t>
+      </w:r>
+      <w:r>
+        <w:t>59</w:t>
+      </w:r>
+      <w:r>
+        <w:rPr>
+          <w:lang w:val="en-US"/>
+        </w:rPr>
+        <w:t>)</w:t>
+      </w:r>
+    </w:p>
+    <w:tbl>
+      <w:tblPr>
+        <w:tblStyle w:val="af3"/>
+        <w:tblW w:w="0" w:type="auto"/>
+        <w:tblLook w:val="04A0" w:firstRow="1" w:lastRow="0" w:firstColumn="1" w:lastColumn="0" w:noHBand="0" w:noVBand="1"/>
+      </w:tblPr>
+      <w:tblGrid>
+        <w:gridCol w:w="1316"/>
+        <w:gridCol w:w="1265"/>
+        <w:gridCol w:w="1203"/>
+        <w:gridCol w:w="1198"/>
+        <w:gridCol w:w="1298"/>
+        <w:gridCol w:w="1234"/>
+        <w:gridCol w:w="1141"/>
+        <w:gridCol w:w="1199"/>
+      </w:tblGrid>
+      <w:tr>
+        <w:tc>
+          <w:tcPr>
+            <w:tcW w:w="1316" w:type="dxa"/>
+          </w:tcPr>
+          <w:p>
+            <w:pPr>
+              <w:pStyle w:val="afe"/>
+              <w:ind w:firstLine="0"/>
+              <w:rPr>
+                <w:lang w:val="en-US"/>
+              </w:rPr>
+            </w:pPr>
+            <w:r>
+              <w:t>Модель</w:t>
+            </w:r>
+          </w:p>
+        </w:tc>
+        <w:tc>
+          <w:tcPr>
+            <w:tcW w:w="1265" w:type="dxa"/>
+          </w:tcPr>
+          <w:p>
+            <w:pPr>
+              <w:pStyle w:val="afe"/>
+              <w:ind w:firstLine="0"/>
+              <w:rPr>
+                <w:lang w:val="en-US"/>
+              </w:rPr>
+            </w:pPr>
+            <w:r>
+              <w:rPr>
+                <w:lang w:val="en-US"/>
+              </w:rPr>
+              <w:t>Linear</w:t>
+            </w:r>
+          </w:p>
+        </w:tc>
+        <w:tc>
+          <w:tcPr>
+            <w:tcW w:w="1203" w:type="dxa"/>
+          </w:tcPr>
+          <w:p>
+            <w:pPr>
+              <w:pStyle w:val="afe"/>
+              <w:ind w:firstLine="0"/>
+              <w:rPr>
+                <w:lang w:val="en-US"/>
+              </w:rPr>
+            </w:pPr>
+            <w:r>
+              <w:rPr>
+                <w:lang w:val="en-US"/>
+              </w:rPr>
+              <w:t>DT</w:t>
+            </w:r>
+          </w:p>
+        </w:tc>
+        <w:tc>
+          <w:tcPr>
+            <w:tcW w:w="1198" w:type="dxa"/>
+          </w:tcPr>
+          <w:p>
+            <w:pPr>
+              <w:pStyle w:val="afe"/>
+              <w:ind w:firstLine="0"/>
+              <w:rPr>
+                <w:lang w:val="en-US"/>
+              </w:rPr>
+            </w:pPr>
+            <w:r>
+              <w:rPr>
+                <w:lang w:val="en-US"/>
+              </w:rPr>
+              <w:t>RF</w:t>
+            </w:r>
+          </w:p>
+        </w:tc>
+        <w:tc>
+          <w:tcPr>
+            <w:tcW w:w="1298" w:type="dxa"/>
+          </w:tcPr>
+          <w:p>
+            <w:pPr>
+              <w:pStyle w:val="afe"/>
+              <w:ind w:firstLine="0"/>
+              <w:rPr>
+                <w:lang w:val="en-US"/>
+              </w:rPr>
+            </w:pPr>
+            <w:proofErr w:type="spellStart"/>
+            <w:r>
+              <w:rPr>
+                <w:lang w:val="en-US"/>
+              </w:rPr>
+              <w:t>GBoost</w:t>
+            </w:r>
+            <w:proofErr w:type="spellEnd"/>
+          </w:p>
+        </w:tc>
+        <w:tc>
+          <w:tcPr>
+            <w:tcW w:w="1234" w:type="dxa"/>
+          </w:tcPr>
+          <w:p>
+            <w:pPr>
+              <w:pStyle w:val="afe"/>
+              <w:ind w:firstLine="0"/>
+              <w:rPr>
+                <w:lang w:val="en-US"/>
+              </w:rPr>
+            </w:pPr>
+            <w:r>
+              <w:rPr>
+                <w:lang w:val="en-US"/>
+              </w:rPr>
+              <w:t>KNN</w:t>
+            </w:r>
+          </w:p>
+        </w:tc>
+        <w:tc>
+          <w:tcPr>
+            <w:tcW w:w="1141" w:type="dxa"/>
+          </w:tcPr>
+          <w:p>
+            <w:pPr>
+              <w:pStyle w:val="afe"/>
+              <w:ind w:firstLine="0"/>
+              <w:rPr>
+                <w:lang w:val="en-US"/>
+              </w:rPr>
+            </w:pPr>
+            <w:proofErr w:type="spellStart"/>
+            <w:r>
+              <w:rPr>
+                <w:lang w:val="en-US"/>
+              </w:rPr>
+              <w:t>Catboost</w:t>
+            </w:r>
+            <w:proofErr w:type="spellEnd"/>
+          </w:p>
+        </w:tc>
+        <w:tc>
+          <w:tcPr>
+            <w:tcW w:w="1199" w:type="dxa"/>
+          </w:tcPr>
+          <w:p>
+            <w:pPr>
+              <w:pStyle w:val="afe"/>
+              <w:ind w:firstLine="0"/>
+              <w:rPr>
+                <w:lang w:val="en-US"/>
+              </w:rPr>
+            </w:pPr>
+            <w:proofErr w:type="spellStart"/>
+            <w:r>
+              <w:rPr>
+                <w:lang w:val="en-US"/>
+              </w:rPr>
+              <w:t>XGBoost</w:t>
+            </w:r>
+            <w:proofErr w:type="spellEnd"/>
+          </w:p>
+        </w:tc>
+      </w:tr>
+      <w:tr>
+        <w:tc>
+          <w:tcPr>
+            <w:tcW w:w="1316" w:type="dxa"/>
+          </w:tcPr>
+          <w:p>
+            <w:pPr>
+              <w:pStyle w:val="afe"/>
+              <w:ind w:firstLine="0"/>
+              <w:rPr>
+                <w:lang w:val="en-US"/>
+              </w:rPr>
+            </w:pPr>
+            <w:r>
+              <w:rPr>
+                <w:lang w:val="en-US"/>
+              </w:rPr>
+              <w:t>R</w:t>
+            </w:r>
+            <w:r>
+              <w:rPr>
+                <w:vertAlign w:val="superscript"/>
+                <w:lang w:val="en-US"/>
+              </w:rPr>
+              <w:t>2</w:t>
+            </w:r>
+            <w:r>
+              <w:rPr>
+                <w:lang w:val="en-US"/>
+              </w:rPr>
+              <w:t xml:space="preserve"> (t</w:t>
+            </w:r>
+            <w:r>
+              <w:rPr>
+                <w:lang w:val="en-US"/>
+              </w:rPr>
+              <w:t>rain</w:t>
+            </w:r>
+            <w:r>
+              <w:rPr>
+                <w:lang w:val="en-US"/>
+              </w:rPr>
+              <w:t>)</w:t>
+            </w:r>
+          </w:p>
+        </w:tc>
+        <w:tc>
+          <w:tcPr>
+            <w:tcW w:w="1265" w:type="dxa"/>
+          </w:tcPr>
+          <w:p>
+            <w:pPr>
+              <w:pStyle w:val="afe"/>
+              <w:ind w:firstLine="0"/>
+              <w:rPr>
+                <w:lang w:val="en-US"/>
+              </w:rPr>
+            </w:pPr>
+            <w:r>
+              <w:t>0</w:t>
+            </w:r>
+            <w:r>
+              <w:rPr>
+                <w:lang w:val="en-US"/>
+              </w:rPr>
+              <w:t>.58</w:t>
+            </w:r>
+          </w:p>
+        </w:tc>
+        <w:tc>
+          <w:tcPr>
+            <w:tcW w:w="1203" w:type="dxa"/>
+          </w:tcPr>
+          <w:p>
+            <w:pPr>
+              <w:pStyle w:val="afe"/>
+              <w:ind w:firstLine="0"/>
+              <w:rPr>
+                <w:lang w:val="en-US"/>
+              </w:rPr>
+            </w:pPr>
+            <w:r>
+              <w:rPr>
+                <w:lang w:val="en-US"/>
+              </w:rPr>
+              <w:t>1</w:t>
+            </w:r>
+          </w:p>
+        </w:tc>
+        <w:tc>
+          <w:tcPr>
+            <w:tcW w:w="1198" w:type="dxa"/>
+          </w:tcPr>
+          <w:p>
+            <w:pPr>
+              <w:pStyle w:val="afe"/>
+              <w:ind w:firstLine="0"/>
+              <w:rPr>
+                <w:lang w:val="en-US"/>
+              </w:rPr>
+            </w:pPr>
+            <w:r>
+              <w:rPr>
+                <w:lang w:val="en-US"/>
+              </w:rPr>
+              <w:t>0.50</w:t>
+            </w:r>
+          </w:p>
+        </w:tc>
+        <w:tc>
+          <w:tcPr>
+            <w:tcW w:w="1298" w:type="dxa"/>
+          </w:tcPr>
+          <w:p>
+            <w:pPr>
+              <w:pStyle w:val="afe"/>
+              <w:ind w:firstLine="0"/>
+              <w:rPr>
+                <w:lang w:val="en-US"/>
+              </w:rPr>
+            </w:pPr>
+            <w:r>
+              <w:rPr>
+                <w:lang w:val="en-US"/>
+              </w:rPr>
+              <w:t>0.92</w:t>
+            </w:r>
+          </w:p>
+        </w:tc>
+        <w:tc>
+          <w:tcPr>
+            <w:tcW w:w="1234" w:type="dxa"/>
+          </w:tcPr>
+          <w:p>
+            <w:pPr>
+              <w:pStyle w:val="afe"/>
+              <w:ind w:firstLine="0"/>
+              <w:rPr>
+                <w:lang w:val="en-US"/>
+              </w:rPr>
+            </w:pPr>
+            <w:r>
+              <w:rPr>
+                <w:lang w:val="en-US"/>
+              </w:rPr>
+              <w:t>0.53</w:t>
+            </w:r>
+          </w:p>
+        </w:tc>
+        <w:tc>
+          <w:tcPr>
+            <w:tcW w:w="1141" w:type="dxa"/>
+          </w:tcPr>
+          <w:p>
+            <w:pPr>
+              <w:pStyle w:val="afe"/>
+              <w:ind w:firstLine="0"/>
+              <w:rPr>
+                <w:lang w:val="en-US"/>
+              </w:rPr>
+            </w:pPr>
+            <w:r>
+              <w:rPr>
+                <w:lang w:val="en-US"/>
+              </w:rPr>
+              <w:t>0.94</w:t>
+            </w:r>
+          </w:p>
+        </w:tc>
+        <w:tc>
+          <w:tcPr>
+            <w:tcW w:w="1199" w:type="dxa"/>
+          </w:tcPr>
+          <w:p>
+            <w:pPr>
+              <w:pStyle w:val="afe"/>
+              <w:ind w:firstLine="0"/>
+              <w:rPr>
+                <w:lang w:val="en-US"/>
+              </w:rPr>
+            </w:pPr>
+            <w:r>
+              <w:rPr>
+                <w:lang w:val="en-US"/>
+              </w:rPr>
+              <w:t>0.94</w:t>
+            </w:r>
+          </w:p>
+        </w:tc>
+      </w:tr>
+      <w:tr>
+        <w:tc>
+          <w:tcPr>
+            <w:tcW w:w="1316" w:type="dxa"/>
+          </w:tcPr>
+          <w:p>
+            <w:pPr>
+              <w:pStyle w:val="afe"/>
+              <w:ind w:firstLine="0"/>
+              <w:rPr>
+                <w:lang w:val="en-US"/>
+              </w:rPr>
+            </w:pPr>
+            <w:r>
+              <w:rPr>
+                <w:lang w:val="en-US"/>
+              </w:rPr>
+              <w:t>R</w:t>
+            </w:r>
+            <w:r>
+              <w:rPr>
+                <w:vertAlign w:val="superscript"/>
+              </w:rPr>
+              <w:t>2</w:t>
+            </w:r>
+            <w:r>
+              <w:rPr>
+                <w:lang w:val="en-US"/>
+              </w:rPr>
+              <w:t xml:space="preserve"> (test)</w:t>
+            </w:r>
+          </w:p>
+        </w:tc>
+        <w:tc>
+          <w:tcPr>
+            <w:tcW w:w="1265" w:type="dxa"/>
+          </w:tcPr>
+          <w:p>
+            <w:pPr>
+              <w:pStyle w:val="afe"/>
+              <w:ind w:firstLine="0"/>
+              <w:rPr>
+                <w:lang w:val="en-US"/>
+              </w:rPr>
+            </w:pPr>
+            <w:r>
+              <w:rPr>
+                <w:lang w:val="en-US"/>
+              </w:rPr>
+              <w:t>0.36</w:t>
+            </w:r>
+          </w:p>
+        </w:tc>
+        <w:tc>
+          <w:tcPr>
+            <w:tcW w:w="1203" w:type="dxa"/>
+          </w:tcPr>
+          <w:p>
+            <w:pPr>
+              <w:pStyle w:val="afe"/>
+              <w:ind w:firstLine="0"/>
+              <w:rPr>
+                <w:lang w:val="en-US"/>
+              </w:rPr>
+            </w:pPr>
+            <w:r>
+              <w:rPr>
+                <w:lang w:val="en-US"/>
+              </w:rPr>
+              <w:t>0.51</w:t>
+            </w:r>
+          </w:p>
+        </w:tc>
+        <w:tc>
+          <w:tcPr>
+            <w:tcW w:w="1198" w:type="dxa"/>
+          </w:tcPr>
+          <w:p>
+            <w:pPr>
+              <w:pStyle w:val="afe"/>
+              <w:ind w:firstLine="0"/>
+              <w:rPr>
+                <w:lang w:val="en-US"/>
+              </w:rPr>
+            </w:pPr>
+            <w:r>
+              <w:rPr>
+                <w:lang w:val="en-US"/>
+              </w:rPr>
+              <w:t>0.41</w:t>
+            </w:r>
+          </w:p>
+        </w:tc>
+        <w:tc>
+          <w:tcPr>
+            <w:tcW w:w="1298" w:type="dxa"/>
+          </w:tcPr>
+          <w:p>
+            <w:pPr>
+              <w:pStyle w:val="afe"/>
+              <w:ind w:firstLine="0"/>
+              <w:rPr>
+                <w:lang w:val="en-US"/>
+              </w:rPr>
+            </w:pPr>
+            <w:r>
+              <w:rPr>
+                <w:lang w:val="en-US"/>
+              </w:rPr>
+              <w:t>0.71</w:t>
+            </w:r>
+          </w:p>
+        </w:tc>
+        <w:tc>
+          <w:tcPr>
+            <w:tcW w:w="1234" w:type="dxa"/>
+          </w:tcPr>
+          <w:p>
+            <w:pPr>
+              <w:pStyle w:val="afe"/>
+              <w:ind w:firstLine="0"/>
+              <w:rPr>
+                <w:lang w:val="en-US"/>
+              </w:rPr>
+            </w:pPr>
+            <w:r>
+              <w:rPr>
+                <w:lang w:val="en-US"/>
+              </w:rPr>
+              <w:t>0.47</w:t>
+            </w:r>
+          </w:p>
+        </w:tc>
+        <w:tc>
+          <w:tcPr>
+            <w:tcW w:w="1141" w:type="dxa"/>
+          </w:tcPr>
+          <w:p>
+            <w:pPr>
+              <w:pStyle w:val="afe"/>
+              <w:ind w:firstLine="0"/>
+              <w:rPr>
+                <w:lang w:val="en-US"/>
+              </w:rPr>
+            </w:pPr>
+            <w:r>
+              <w:rPr>
+                <w:lang w:val="en-US"/>
+              </w:rPr>
+              <w:t>0.73</w:t>
+            </w:r>
+          </w:p>
+        </w:tc>
+        <w:tc>
+          <w:tcPr>
+            <w:tcW w:w="1199" w:type="dxa"/>
+          </w:tcPr>
+          <w:p>
+            <w:pPr>
+              <w:pStyle w:val="afe"/>
+              <w:ind w:firstLine="0"/>
+              <w:rPr>
+                <w:lang w:val="en-US"/>
+              </w:rPr>
+            </w:pPr>
+            <w:r>
+              <w:rPr>
+                <w:lang w:val="en-US"/>
+              </w:rPr>
+              <w:t>0.70</w:t>
+            </w:r>
+          </w:p>
+        </w:tc>
+      </w:tr>
+      <w:tr>
+        <w:tc>
+          <w:tcPr>
+            <w:tcW w:w="1316" w:type="dxa"/>
+          </w:tcPr>
+          <w:p>
+            <w:pPr>
+              <w:pStyle w:val="afe"/>
+              <w:ind w:firstLine="0"/>
+              <w:rPr>
+                <w:lang w:val="en-US"/>
+              </w:rPr>
+            </w:pPr>
+            <w:r>
+              <w:rPr>
+                <w:lang w:val="en-US"/>
+              </w:rPr>
+              <w:t>RMSE</w:t>
+            </w:r>
+          </w:p>
+        </w:tc>
+        <w:tc>
+          <w:tcPr>
+            <w:tcW w:w="1265" w:type="dxa"/>
+          </w:tcPr>
+          <w:p>
+            <w:pPr>
+              <w:pStyle w:val="afe"/>
+              <w:ind w:firstLine="0"/>
+              <w:rPr>
+                <w:lang w:val="en-US"/>
+              </w:rPr>
+            </w:pPr>
+            <w:r>
+              <w:rPr>
+                <w:lang w:val="en-US"/>
+              </w:rPr>
+              <w:t>2.54</w:t>
+            </w:r>
+          </w:p>
+        </w:tc>
+        <w:tc>
+          <w:tcPr>
+            <w:tcW w:w="1203" w:type="dxa"/>
+          </w:tcPr>
+          <w:p>
+            <w:pPr>
+              <w:pStyle w:val="afe"/>
+              <w:ind w:firstLine="0"/>
+              <w:rPr>
+                <w:lang w:val="en-US"/>
+              </w:rPr>
+            </w:pPr>
+            <w:r>
+              <w:rPr>
+                <w:lang w:val="en-US"/>
+              </w:rPr>
+              <w:t>2.22</w:t>
+            </w:r>
+          </w:p>
+        </w:tc>
+        <w:tc>
+          <w:tcPr>
+            <w:tcW w:w="1198" w:type="dxa"/>
+          </w:tcPr>
+          <w:p>
+            <w:pPr>
+              <w:pStyle w:val="afe"/>
+              <w:ind w:firstLine="0"/>
+              <w:rPr>
+                <w:lang w:val="en-US"/>
+              </w:rPr>
+            </w:pPr>
+            <w:r>
+              <w:rPr>
+                <w:lang w:val="en-US"/>
+              </w:rPr>
+              <w:t>2.44</w:t>
+            </w:r>
+          </w:p>
+        </w:tc>
+        <w:tc>
+          <w:tcPr>
+            <w:tcW w:w="1298" w:type="dxa"/>
+          </w:tcPr>
+          <w:p>
+            <w:pPr>
+              <w:pStyle w:val="afe"/>
+              <w:ind w:firstLine="0"/>
+              <w:rPr>
+                <w:lang w:val="en-US"/>
+              </w:rPr>
+            </w:pPr>
+            <w:r>
+              <w:rPr>
+                <w:lang w:val="en-US"/>
+              </w:rPr>
+              <w:t>1.70</w:t>
+            </w:r>
+          </w:p>
+        </w:tc>
+        <w:tc>
+          <w:tcPr>
+            <w:tcW w:w="1234" w:type="dxa"/>
+          </w:tcPr>
+          <w:p>
+            <w:pPr>
+              <w:pStyle w:val="afe"/>
+              <w:ind w:firstLine="0"/>
+              <w:rPr>
+                <w:lang w:val="en-US"/>
+              </w:rPr>
+            </w:pPr>
+            <w:r>
+              <w:rPr>
+                <w:lang w:val="en-US"/>
+              </w:rPr>
+              <w:t>2.32</w:t>
+            </w:r>
+          </w:p>
+        </w:tc>
+        <w:tc>
+          <w:tcPr>
+            <w:tcW w:w="1141" w:type="dxa"/>
+          </w:tcPr>
+          <w:p>
+            <w:pPr>
+              <w:pStyle w:val="afe"/>
+              <w:ind w:firstLine="0"/>
+              <w:rPr>
+                <w:lang w:val="en-US"/>
+              </w:rPr>
+            </w:pPr>
+            <w:r>
+              <w:rPr>
+                <w:lang w:val="en-US"/>
+              </w:rPr>
+              <w:t>1.66</w:t>
+            </w:r>
+          </w:p>
+        </w:tc>
+        <w:tc>
+          <w:tcPr>
+            <w:tcW w:w="1199" w:type="dxa"/>
+          </w:tcPr>
+          <w:p>
+            <w:pPr>
+              <w:pStyle w:val="afe"/>
+              <w:ind w:firstLine="0"/>
+              <w:rPr>
+                <w:lang w:val="en-US"/>
+              </w:rPr>
+            </w:pPr>
+            <w:r>
+              <w:rPr>
+                <w:lang w:val="en-US"/>
+              </w:rPr>
+              <w:t>1.73</w:t>
+            </w:r>
+          </w:p>
+        </w:tc>
+      </w:tr>
+    </w:tbl>
+    <w:p>
+      <w:pPr>
         <w:rPr>
           <w:lang w:val="en-US"/>
         </w:rPr>
@@ -15035,24 +16859,1828 @@
     </w:p>
     <w:p>
       <w:pPr>
+        <w:pStyle w:val="afe"/>
+      </w:pPr>
+      <w:r>
+        <w:t xml:space="preserve">Объединенный </w:t>
+      </w:r>
+      <w:proofErr w:type="spellStart"/>
+      <w:r>
+        <w:t>датасет</w:t>
+      </w:r>
+      <w:proofErr w:type="spellEnd"/>
+      <w:r>
+        <w:t>.</w:t>
+      </w:r>
+      <w:r>
+        <w:t xml:space="preserve"> </w:t>
+      </w:r>
+      <w:r>
         <w:rPr>
           <w:lang w:val="en-US"/>
         </w:rPr>
-      </w:pPr>
+        <w:t>Test</w:t>
+      </w:r>
+      <w:r>
+        <w:t>/</w:t>
+      </w:r>
       <w:r>
         <w:rPr>
           <w:lang w:val="en-US"/>
         </w:rPr>
-        <w:t>Small dataset</w:t>
-      </w:r>
+        <w:t>train</w:t>
+      </w:r>
+      <w:r>
+        <w:t xml:space="preserve"> </w:t>
+      </w:r>
+      <w:r>
+        <w:rPr>
+          <w:lang w:val="en-US"/>
+        </w:rPr>
+        <w:t>split</w:t>
+      </w:r>
+      <w:r>
+        <w:t xml:space="preserve">, </w:t>
+      </w:r>
+      <w:r>
+        <w:t>без</w:t>
+      </w:r>
+      <w:r>
+        <w:t xml:space="preserve"> </w:t>
+      </w:r>
+      <w:proofErr w:type="spellStart"/>
+      <w:r>
+        <w:t>эмбеддингов</w:t>
+      </w:r>
+      <w:proofErr w:type="spellEnd"/>
+      <w:r>
+        <w:t xml:space="preserve">, </w:t>
+      </w:r>
+      <w:r>
+        <w:t>без</w:t>
+      </w:r>
+      <w:r>
+        <w:t xml:space="preserve"> </w:t>
+      </w:r>
+      <w:r>
+        <w:t>аугментации</w:t>
+      </w:r>
+      <w:r>
+        <w:t xml:space="preserve"> </w:t>
+      </w:r>
+      <w:r>
+        <w:t>данных</w:t>
+      </w:r>
+      <w:r>
+        <w:t xml:space="preserve">, </w:t>
+      </w:r>
+      <w:proofErr w:type="spellStart"/>
+      <w:r>
+        <w:t>клиппинг</w:t>
+      </w:r>
+      <w:proofErr w:type="spellEnd"/>
+      <w:r>
+        <w:t xml:space="preserve"> </w:t>
+      </w:r>
+      <w:r>
+        <w:t>при</w:t>
+      </w:r>
+      <w:r>
+        <w:t xml:space="preserve"> </w:t>
+      </w:r>
+      <w:r>
+        <w:t>удалении</w:t>
+      </w:r>
+      <w:r>
+        <w:t xml:space="preserve"> </w:t>
+      </w:r>
+      <w:r>
+        <w:t>выбросов</w:t>
+      </w:r>
+      <w:r>
+        <w:t xml:space="preserve">, </w:t>
+      </w:r>
+      <w:r>
+        <w:t>стратификация</w:t>
+      </w:r>
+      <w:r>
+        <w:t xml:space="preserve"> </w:t>
+      </w:r>
+      <w:r>
+        <w:t>при</w:t>
+      </w:r>
+      <w:r>
+        <w:t xml:space="preserve"> </w:t>
+      </w:r>
+      <w:r>
+        <w:t>сплите</w:t>
+      </w:r>
+      <w:r>
+        <w:t xml:space="preserve">, </w:t>
+      </w:r>
+      <w:r>
+        <w:t xml:space="preserve">ручной выбор второго набора </w:t>
+      </w:r>
+      <w:proofErr w:type="spellStart"/>
+      <w:r>
+        <w:t>фич</w:t>
+      </w:r>
+      <w:proofErr w:type="spellEnd"/>
+      <w:r>
+        <w:t>,</w:t>
+      </w:r>
+      <w:r>
+        <w:t xml:space="preserve"> </w:t>
+      </w:r>
+      <w:r>
+        <w:t>без</w:t>
+      </w:r>
+      <w:r>
+        <w:t xml:space="preserve"> </w:t>
+      </w:r>
+      <w:proofErr w:type="spellStart"/>
+      <w:r>
+        <w:t>гиперпараметров</w:t>
+      </w:r>
+      <w:proofErr w:type="spellEnd"/>
+      <w:r>
+        <w:t xml:space="preserve">. </w:t>
+      </w:r>
+      <w:r>
+        <w:t>(</w:t>
+      </w:r>
+      <w:r>
+        <w:t>7</w:t>
+      </w:r>
+      <w:r>
+        <w:t xml:space="preserve">89, </w:t>
+      </w:r>
+      <w:r>
+        <w:t>12</w:t>
+      </w:r>
+      <w:r>
+        <w:t>)</w:t>
+      </w:r>
+    </w:p>
+    <w:tbl>
+      <w:tblPr>
+        <w:tblStyle w:val="af3"/>
+        <w:tblW w:w="0" w:type="auto"/>
+        <w:tblLook w:val="04A0" w:firstRow="1" w:lastRow="0" w:firstColumn="1" w:lastColumn="0" w:noHBand="0" w:noVBand="1"/>
+      </w:tblPr>
+      <w:tblGrid>
+        <w:gridCol w:w="1316"/>
+        <w:gridCol w:w="1265"/>
+        <w:gridCol w:w="1203"/>
+        <w:gridCol w:w="1198"/>
+        <w:gridCol w:w="1298"/>
+        <w:gridCol w:w="1234"/>
+        <w:gridCol w:w="1141"/>
+        <w:gridCol w:w="1199"/>
+      </w:tblGrid>
+      <w:tr>
+        <w:tc>
+          <w:tcPr>
+            <w:tcW w:w="1316" w:type="dxa"/>
+          </w:tcPr>
+          <w:p>
+            <w:pPr>
+              <w:pStyle w:val="afe"/>
+              <w:ind w:firstLine="0"/>
+              <w:rPr>
+                <w:lang w:val="en-US"/>
+              </w:rPr>
+            </w:pPr>
+            <w:r>
+              <w:t>Модель</w:t>
+            </w:r>
+          </w:p>
+        </w:tc>
+        <w:tc>
+          <w:tcPr>
+            <w:tcW w:w="1265" w:type="dxa"/>
+          </w:tcPr>
+          <w:p>
+            <w:pPr>
+              <w:pStyle w:val="afe"/>
+              <w:ind w:firstLine="0"/>
+              <w:rPr>
+                <w:lang w:val="en-US"/>
+              </w:rPr>
+            </w:pPr>
+            <w:r>
+              <w:rPr>
+                <w:lang w:val="en-US"/>
+              </w:rPr>
+              <w:t>Linear</w:t>
+            </w:r>
+          </w:p>
+        </w:tc>
+        <w:tc>
+          <w:tcPr>
+            <w:tcW w:w="1203" w:type="dxa"/>
+          </w:tcPr>
+          <w:p>
+            <w:pPr>
+              <w:pStyle w:val="afe"/>
+              <w:ind w:firstLine="0"/>
+              <w:rPr>
+                <w:lang w:val="en-US"/>
+              </w:rPr>
+            </w:pPr>
+            <w:r>
+              <w:rPr>
+                <w:lang w:val="en-US"/>
+              </w:rPr>
+              <w:t>DT</w:t>
+            </w:r>
+          </w:p>
+        </w:tc>
+        <w:tc>
+          <w:tcPr>
+            <w:tcW w:w="1198" w:type="dxa"/>
+          </w:tcPr>
+          <w:p>
+            <w:pPr>
+              <w:pStyle w:val="afe"/>
+              <w:ind w:firstLine="0"/>
+              <w:rPr>
+                <w:lang w:val="en-US"/>
+              </w:rPr>
+            </w:pPr>
+            <w:r>
+              <w:rPr>
+                <w:lang w:val="en-US"/>
+              </w:rPr>
+              <w:t>RF</w:t>
+            </w:r>
+          </w:p>
+        </w:tc>
+        <w:tc>
+          <w:tcPr>
+            <w:tcW w:w="1298" w:type="dxa"/>
+          </w:tcPr>
+          <w:p>
+            <w:pPr>
+              <w:pStyle w:val="afe"/>
+              <w:ind w:firstLine="0"/>
+              <w:rPr>
+                <w:lang w:val="en-US"/>
+              </w:rPr>
+            </w:pPr>
+            <w:proofErr w:type="spellStart"/>
+            <w:r>
+              <w:rPr>
+                <w:lang w:val="en-US"/>
+              </w:rPr>
+              <w:t>GBoost</w:t>
+            </w:r>
+            <w:proofErr w:type="spellEnd"/>
+          </w:p>
+        </w:tc>
+        <w:tc>
+          <w:tcPr>
+            <w:tcW w:w="1234" w:type="dxa"/>
+          </w:tcPr>
+          <w:p>
+            <w:pPr>
+              <w:pStyle w:val="afe"/>
+              <w:ind w:firstLine="0"/>
+              <w:rPr>
+                <w:lang w:val="en-US"/>
+              </w:rPr>
+            </w:pPr>
+            <w:r>
+              <w:rPr>
+                <w:lang w:val="en-US"/>
+              </w:rPr>
+              <w:t>KNN</w:t>
+            </w:r>
+          </w:p>
+        </w:tc>
+        <w:tc>
+          <w:tcPr>
+            <w:tcW w:w="1141" w:type="dxa"/>
+          </w:tcPr>
+          <w:p>
+            <w:pPr>
+              <w:pStyle w:val="afe"/>
+              <w:ind w:firstLine="0"/>
+              <w:rPr>
+                <w:lang w:val="en-US"/>
+              </w:rPr>
+            </w:pPr>
+            <w:proofErr w:type="spellStart"/>
+            <w:r>
+              <w:rPr>
+                <w:lang w:val="en-US"/>
+              </w:rPr>
+              <w:t>Catboost</w:t>
+            </w:r>
+            <w:proofErr w:type="spellEnd"/>
+          </w:p>
+        </w:tc>
+        <w:tc>
+          <w:tcPr>
+            <w:tcW w:w="1199" w:type="dxa"/>
+          </w:tcPr>
+          <w:p>
+            <w:pPr>
+              <w:pStyle w:val="afe"/>
+              <w:ind w:firstLine="0"/>
+              <w:rPr>
+                <w:lang w:val="en-US"/>
+              </w:rPr>
+            </w:pPr>
+            <w:proofErr w:type="spellStart"/>
+            <w:r>
+              <w:rPr>
+                <w:lang w:val="en-US"/>
+              </w:rPr>
+              <w:t>XGBoost</w:t>
+            </w:r>
+            <w:proofErr w:type="spellEnd"/>
+          </w:p>
+        </w:tc>
+      </w:tr>
+      <w:tr>
+        <w:tc>
+          <w:tcPr>
+            <w:tcW w:w="1316" w:type="dxa"/>
+          </w:tcPr>
+          <w:p>
+            <w:pPr>
+              <w:pStyle w:val="afe"/>
+              <w:ind w:firstLine="0"/>
+              <w:rPr>
+                <w:lang w:val="en-US"/>
+              </w:rPr>
+            </w:pPr>
+            <w:r>
+              <w:rPr>
+                <w:lang w:val="en-US"/>
+              </w:rPr>
+              <w:t>R</w:t>
+            </w:r>
+            <w:r>
+              <w:rPr>
+                <w:vertAlign w:val="superscript"/>
+                <w:lang w:val="en-US"/>
+              </w:rPr>
+              <w:t>2</w:t>
+            </w:r>
+            <w:r>
+              <w:rPr>
+                <w:lang w:val="en-US"/>
+              </w:rPr>
+              <w:t xml:space="preserve"> (t</w:t>
+            </w:r>
+            <w:r>
+              <w:rPr>
+                <w:lang w:val="en-US"/>
+              </w:rPr>
+              <w:t>rain</w:t>
+            </w:r>
+            <w:r>
+              <w:rPr>
+                <w:lang w:val="en-US"/>
+              </w:rPr>
+              <w:t>)</w:t>
+            </w:r>
+          </w:p>
+        </w:tc>
+        <w:tc>
+          <w:tcPr>
+            <w:tcW w:w="1265" w:type="dxa"/>
+          </w:tcPr>
+          <w:p>
+            <w:pPr>
+              <w:pStyle w:val="afe"/>
+              <w:ind w:firstLine="0"/>
+              <w:rPr>
+                <w:lang w:val="en-US"/>
+              </w:rPr>
+            </w:pPr>
+            <w:r>
+              <w:rPr>
+                <w:lang w:val="en-US"/>
+              </w:rPr>
+              <w:t>0.30</w:t>
+            </w:r>
+          </w:p>
+        </w:tc>
+        <w:tc>
+          <w:tcPr>
+            <w:tcW w:w="1203" w:type="dxa"/>
+          </w:tcPr>
+          <w:p>
+            <w:pPr>
+              <w:pStyle w:val="afe"/>
+              <w:ind w:firstLine="0"/>
+              <w:rPr>
+                <w:lang w:val="en-US"/>
+              </w:rPr>
+            </w:pPr>
+            <w:r>
+              <w:rPr>
+                <w:lang w:val="en-US"/>
+              </w:rPr>
+              <w:t>0.99</w:t>
+            </w:r>
+          </w:p>
+        </w:tc>
+        <w:tc>
+          <w:tcPr>
+            <w:tcW w:w="1198" w:type="dxa"/>
+          </w:tcPr>
+          <w:p>
+            <w:pPr>
+              <w:pStyle w:val="afe"/>
+              <w:ind w:firstLine="0"/>
+              <w:rPr>
+                <w:lang w:val="en-US"/>
+              </w:rPr>
+            </w:pPr>
+            <w:r>
+              <w:rPr>
+                <w:lang w:val="en-US"/>
+              </w:rPr>
+              <w:t>0.58</w:t>
+            </w:r>
+          </w:p>
+        </w:tc>
+        <w:tc>
+          <w:tcPr>
+            <w:tcW w:w="1298" w:type="dxa"/>
+          </w:tcPr>
+          <w:p>
+            <w:pPr>
+              <w:pStyle w:val="afe"/>
+              <w:ind w:firstLine="0"/>
+              <w:rPr>
+                <w:lang w:val="en-US"/>
+              </w:rPr>
+            </w:pPr>
+            <w:r>
+              <w:rPr>
+                <w:lang w:val="en-US"/>
+              </w:rPr>
+              <w:t>0.90</w:t>
+            </w:r>
+          </w:p>
+        </w:tc>
+        <w:tc>
+          <w:tcPr>
+            <w:tcW w:w="1234" w:type="dxa"/>
+          </w:tcPr>
+          <w:p>
+            <w:pPr>
+              <w:pStyle w:val="afe"/>
+              <w:ind w:firstLine="0"/>
+              <w:rPr>
+                <w:lang w:val="en-US"/>
+              </w:rPr>
+            </w:pPr>
+            <w:r>
+              <w:rPr>
+                <w:lang w:val="en-US"/>
+              </w:rPr>
+              <w:t>0.53</w:t>
+            </w:r>
+          </w:p>
+        </w:tc>
+        <w:tc>
+          <w:tcPr>
+            <w:tcW w:w="1141" w:type="dxa"/>
+          </w:tcPr>
+          <w:p>
+            <w:pPr>
+              <w:pStyle w:val="afe"/>
+              <w:ind w:firstLine="0"/>
+              <w:rPr>
+                <w:lang w:val="en-US"/>
+              </w:rPr>
+            </w:pPr>
+            <w:r>
+              <w:rPr>
+                <w:lang w:val="en-US"/>
+              </w:rPr>
+              <w:t>0.93</w:t>
+            </w:r>
+          </w:p>
+        </w:tc>
+        <w:tc>
+          <w:tcPr>
+            <w:tcW w:w="1199" w:type="dxa"/>
+          </w:tcPr>
+          <w:p>
+            <w:pPr>
+              <w:pStyle w:val="afe"/>
+              <w:ind w:firstLine="0"/>
+              <w:rPr>
+                <w:lang w:val="en-US"/>
+              </w:rPr>
+            </w:pPr>
+            <w:r>
+              <w:rPr>
+                <w:lang w:val="en-US"/>
+              </w:rPr>
+              <w:t>0.93</w:t>
+            </w:r>
+          </w:p>
+        </w:tc>
+      </w:tr>
+      <w:tr>
+        <w:tc>
+          <w:tcPr>
+            <w:tcW w:w="1316" w:type="dxa"/>
+          </w:tcPr>
+          <w:p>
+            <w:pPr>
+              <w:pStyle w:val="afe"/>
+              <w:ind w:firstLine="0"/>
+              <w:rPr>
+                <w:lang w:val="en-US"/>
+              </w:rPr>
+            </w:pPr>
+            <w:r>
+              <w:rPr>
+                <w:lang w:val="en-US"/>
+              </w:rPr>
+              <w:t>R</w:t>
+            </w:r>
+            <w:r>
+              <w:rPr>
+                <w:vertAlign w:val="superscript"/>
+              </w:rPr>
+              <w:t>2</w:t>
+            </w:r>
+            <w:r>
+              <w:rPr>
+                <w:lang w:val="en-US"/>
+              </w:rPr>
+              <w:t xml:space="preserve"> (test)</w:t>
+            </w:r>
+          </w:p>
+        </w:tc>
+        <w:tc>
+          <w:tcPr>
+            <w:tcW w:w="1265" w:type="dxa"/>
+          </w:tcPr>
+          <w:p>
+            <w:pPr>
+              <w:pStyle w:val="afe"/>
+              <w:ind w:firstLine="0"/>
+              <w:rPr>
+                <w:lang w:val="en-US"/>
+              </w:rPr>
+            </w:pPr>
+            <w:r>
+              <w:rPr>
+                <w:lang w:val="en-US"/>
+              </w:rPr>
+              <w:t>0.30</w:t>
+            </w:r>
+          </w:p>
+        </w:tc>
+        <w:tc>
+          <w:tcPr>
+            <w:tcW w:w="1203" w:type="dxa"/>
+          </w:tcPr>
+          <w:p>
+            <w:pPr>
+              <w:pStyle w:val="afe"/>
+              <w:ind w:firstLine="0"/>
+              <w:rPr>
+                <w:lang w:val="en-US"/>
+              </w:rPr>
+            </w:pPr>
+            <w:r>
+              <w:rPr>
+                <w:lang w:val="en-US"/>
+              </w:rPr>
+              <w:t>0.58</w:t>
+            </w:r>
+          </w:p>
+        </w:tc>
+        <w:tc>
+          <w:tcPr>
+            <w:tcW w:w="1198" w:type="dxa"/>
+          </w:tcPr>
+          <w:p>
+            <w:pPr>
+              <w:pStyle w:val="afe"/>
+              <w:ind w:firstLine="0"/>
+              <w:rPr>
+                <w:lang w:val="en-US"/>
+              </w:rPr>
+            </w:pPr>
+            <w:r>
+              <w:rPr>
+                <w:lang w:val="en-US"/>
+              </w:rPr>
+              <w:t>0.49</w:t>
+            </w:r>
+          </w:p>
+        </w:tc>
+        <w:tc>
+          <w:tcPr>
+            <w:tcW w:w="1298" w:type="dxa"/>
+          </w:tcPr>
+          <w:p>
+            <w:pPr>
+              <w:pStyle w:val="afe"/>
+              <w:ind w:firstLine="0"/>
+              <w:rPr>
+                <w:lang w:val="en-US"/>
+              </w:rPr>
+            </w:pPr>
+            <w:r>
+              <w:rPr>
+                <w:lang w:val="en-US"/>
+              </w:rPr>
+              <w:t>0.66</w:t>
+            </w:r>
+          </w:p>
+        </w:tc>
+        <w:tc>
+          <w:tcPr>
+            <w:tcW w:w="1234" w:type="dxa"/>
+          </w:tcPr>
+          <w:p>
+            <w:pPr>
+              <w:pStyle w:val="afe"/>
+              <w:ind w:firstLine="0"/>
+              <w:rPr>
+                <w:lang w:val="en-US"/>
+              </w:rPr>
+            </w:pPr>
+            <w:r>
+              <w:rPr>
+                <w:lang w:val="en-US"/>
+              </w:rPr>
+              <w:t>0.44</w:t>
+            </w:r>
+          </w:p>
+        </w:tc>
+        <w:tc>
+          <w:tcPr>
+            <w:tcW w:w="1141" w:type="dxa"/>
+          </w:tcPr>
+          <w:p>
+            <w:pPr>
+              <w:pStyle w:val="afe"/>
+              <w:ind w:firstLine="0"/>
+              <w:rPr>
+                <w:lang w:val="en-US"/>
+              </w:rPr>
+            </w:pPr>
+            <w:r>
+              <w:rPr>
+                <w:lang w:val="en-US"/>
+              </w:rPr>
+              <w:t>0.70</w:t>
+            </w:r>
+          </w:p>
+        </w:tc>
+        <w:tc>
+          <w:tcPr>
+            <w:tcW w:w="1199" w:type="dxa"/>
+          </w:tcPr>
+          <w:p>
+            <w:pPr>
+              <w:pStyle w:val="afe"/>
+              <w:ind w:firstLine="0"/>
+              <w:rPr>
+                <w:lang w:val="en-US"/>
+              </w:rPr>
+            </w:pPr>
+            <w:r>
+              <w:rPr>
+                <w:lang w:val="en-US"/>
+              </w:rPr>
+              <w:t>0.68</w:t>
+            </w:r>
+          </w:p>
+        </w:tc>
+      </w:tr>
+      <w:tr>
+        <w:tc>
+          <w:tcPr>
+            <w:tcW w:w="1316" w:type="dxa"/>
+          </w:tcPr>
+          <w:p>
+            <w:pPr>
+              <w:pStyle w:val="afe"/>
+              <w:ind w:firstLine="0"/>
+              <w:rPr>
+                <w:lang w:val="en-US"/>
+              </w:rPr>
+            </w:pPr>
+            <w:r>
+              <w:rPr>
+                <w:lang w:val="en-US"/>
+              </w:rPr>
+              <w:t>RMSE</w:t>
+            </w:r>
+          </w:p>
+        </w:tc>
+        <w:tc>
+          <w:tcPr>
+            <w:tcW w:w="1265" w:type="dxa"/>
+          </w:tcPr>
+          <w:p>
+            <w:pPr>
+              <w:pStyle w:val="afe"/>
+              <w:ind w:firstLine="0"/>
+              <w:rPr>
+                <w:lang w:val="en-US"/>
+              </w:rPr>
+            </w:pPr>
+            <w:r>
+              <w:rPr>
+                <w:lang w:val="en-US"/>
+              </w:rPr>
+              <w:t>2.66</w:t>
+            </w:r>
+          </w:p>
+        </w:tc>
+        <w:tc>
+          <w:tcPr>
+            <w:tcW w:w="1203" w:type="dxa"/>
+          </w:tcPr>
+          <w:p>
+            <w:pPr>
+              <w:pStyle w:val="afe"/>
+              <w:ind w:firstLine="0"/>
+              <w:rPr>
+                <w:lang w:val="en-US"/>
+              </w:rPr>
+            </w:pPr>
+            <w:r>
+              <w:rPr>
+                <w:lang w:val="en-US"/>
+              </w:rPr>
+              <w:t>2.04</w:t>
+            </w:r>
+          </w:p>
+        </w:tc>
+        <w:tc>
+          <w:tcPr>
+            <w:tcW w:w="1198" w:type="dxa"/>
+          </w:tcPr>
+          <w:p>
+            <w:pPr>
+              <w:pStyle w:val="afe"/>
+              <w:ind w:firstLine="0"/>
+              <w:rPr>
+                <w:lang w:val="en-US"/>
+              </w:rPr>
+            </w:pPr>
+            <w:r>
+              <w:rPr>
+                <w:lang w:val="en-US"/>
+              </w:rPr>
+              <w:t>2.25</w:t>
+            </w:r>
+          </w:p>
+        </w:tc>
+        <w:tc>
+          <w:tcPr>
+            <w:tcW w:w="1298" w:type="dxa"/>
+          </w:tcPr>
+          <w:p>
+            <w:pPr>
+              <w:pStyle w:val="afe"/>
+              <w:ind w:firstLine="0"/>
+              <w:rPr>
+                <w:lang w:val="en-US"/>
+              </w:rPr>
+            </w:pPr>
+            <w:r>
+              <w:rPr>
+                <w:lang w:val="en-US"/>
+              </w:rPr>
+              <w:t>1.80</w:t>
+            </w:r>
+          </w:p>
+        </w:tc>
+        <w:tc>
+          <w:tcPr>
+            <w:tcW w:w="1234" w:type="dxa"/>
+          </w:tcPr>
+          <w:p>
+            <w:pPr>
+              <w:pStyle w:val="afe"/>
+              <w:ind w:firstLine="0"/>
+              <w:rPr>
+                <w:lang w:val="en-US"/>
+              </w:rPr>
+            </w:pPr>
+            <w:r>
+              <w:rPr>
+                <w:lang w:val="en-US"/>
+              </w:rPr>
+              <w:t>2.36</w:t>
+            </w:r>
+          </w:p>
+        </w:tc>
+        <w:tc>
+          <w:tcPr>
+            <w:tcW w:w="1141" w:type="dxa"/>
+          </w:tcPr>
+          <w:p>
+            <w:pPr>
+              <w:pStyle w:val="afe"/>
+              <w:ind w:firstLine="0"/>
+              <w:rPr>
+                <w:lang w:val="en-US"/>
+              </w:rPr>
+            </w:pPr>
+            <w:r>
+              <w:rPr>
+                <w:lang w:val="en-US"/>
+              </w:rPr>
+              <w:t>1.74</w:t>
+            </w:r>
+          </w:p>
+        </w:tc>
+        <w:tc>
+          <w:tcPr>
+            <w:tcW w:w="1199" w:type="dxa"/>
+          </w:tcPr>
+          <w:p>
+            <w:pPr>
+              <w:pStyle w:val="afe"/>
+              <w:ind w:firstLine="0"/>
+              <w:rPr>
+                <w:lang w:val="en-US"/>
+              </w:rPr>
+            </w:pPr>
+            <w:r>
+              <w:rPr>
+                <w:lang w:val="en-US"/>
+              </w:rPr>
+              <w:t>1.79</w:t>
+            </w:r>
+          </w:p>
+        </w:tc>
+      </w:tr>
+    </w:tbl>
+    <w:p/>
+    <w:p>
+      <w:pPr>
+        <w:pStyle w:val="afe"/>
+      </w:pPr>
+      <w:r>
+        <w:t xml:space="preserve">Объединенный </w:t>
+      </w:r>
+      <w:proofErr w:type="spellStart"/>
+      <w:r>
+        <w:t>датасет</w:t>
+      </w:r>
+      <w:proofErr w:type="spellEnd"/>
+      <w:r>
+        <w:t>.</w:t>
+      </w:r>
+      <w:r>
+        <w:t xml:space="preserve"> </w:t>
+      </w:r>
+      <w:r>
+        <w:rPr>
+          <w:lang w:val="en-US"/>
+        </w:rPr>
+        <w:t>Test</w:t>
+      </w:r>
+      <w:r>
+        <w:t>/</w:t>
+      </w:r>
+      <w:r>
+        <w:rPr>
+          <w:lang w:val="en-US"/>
+        </w:rPr>
+        <w:t>train</w:t>
+      </w:r>
+      <w:r>
+        <w:t xml:space="preserve"> </w:t>
+      </w:r>
+      <w:r>
+        <w:rPr>
+          <w:lang w:val="en-US"/>
+        </w:rPr>
+        <w:t>split</w:t>
+      </w:r>
+      <w:r>
+        <w:t xml:space="preserve">, </w:t>
+      </w:r>
+      <w:r>
+        <w:t>без</w:t>
+      </w:r>
+      <w:r>
+        <w:t xml:space="preserve"> </w:t>
+      </w:r>
+      <w:proofErr w:type="spellStart"/>
+      <w:r>
+        <w:t>эмбеддингов</w:t>
+      </w:r>
+      <w:proofErr w:type="spellEnd"/>
+      <w:r>
+        <w:t xml:space="preserve">, </w:t>
+      </w:r>
+      <w:r>
+        <w:t>без</w:t>
+      </w:r>
+      <w:r>
+        <w:t xml:space="preserve"> </w:t>
+      </w:r>
+      <w:r>
+        <w:t>аугментации</w:t>
+      </w:r>
+      <w:r>
+        <w:t xml:space="preserve"> </w:t>
+      </w:r>
+      <w:r>
+        <w:t>данных</w:t>
+      </w:r>
+      <w:r>
+        <w:t xml:space="preserve">, </w:t>
+      </w:r>
+      <w:proofErr w:type="spellStart"/>
+      <w:r>
+        <w:t>клиппинг</w:t>
+      </w:r>
+      <w:proofErr w:type="spellEnd"/>
+      <w:r>
+        <w:t xml:space="preserve"> </w:t>
+      </w:r>
+      <w:r>
+        <w:t>при</w:t>
+      </w:r>
+      <w:r>
+        <w:t xml:space="preserve"> </w:t>
+      </w:r>
+      <w:r>
+        <w:t>удалении</w:t>
+      </w:r>
+      <w:r>
+        <w:t xml:space="preserve"> </w:t>
+      </w:r>
+      <w:r>
+        <w:t>выбросов</w:t>
+      </w:r>
+      <w:r>
+        <w:t xml:space="preserve">, </w:t>
+      </w:r>
+      <w:r>
+        <w:t>стратификация</w:t>
+      </w:r>
+      <w:r>
+        <w:t xml:space="preserve"> </w:t>
+      </w:r>
+      <w:r>
+        <w:t>при</w:t>
+      </w:r>
+      <w:r>
+        <w:t xml:space="preserve"> </w:t>
+      </w:r>
+      <w:r>
+        <w:t>сплите</w:t>
+      </w:r>
+      <w:r>
+        <w:t xml:space="preserve">, </w:t>
+      </w:r>
+      <w:r>
+        <w:t>выбор</w:t>
+      </w:r>
+      <w:r>
+        <w:t xml:space="preserve"> </w:t>
+      </w:r>
+      <w:proofErr w:type="spellStart"/>
+      <w:r>
+        <w:t>фич</w:t>
+      </w:r>
+      <w:proofErr w:type="spellEnd"/>
+      <w:r>
+        <w:t xml:space="preserve"> </w:t>
+      </w:r>
+      <w:r>
+        <w:t>по</w:t>
+      </w:r>
+      <w:r>
+        <w:t xml:space="preserve"> </w:t>
+      </w:r>
+      <w:r>
+        <w:t>порогу</w:t>
+      </w:r>
+      <w:r>
+        <w:t xml:space="preserve"> </w:t>
+      </w:r>
+      <w:r>
+        <w:t>корреляции</w:t>
+      </w:r>
+      <w:r>
+        <w:t xml:space="preserve"> (0.95)</w:t>
+      </w:r>
+      <w:r>
+        <w:t>,</w:t>
+      </w:r>
+      <w:r>
+        <w:t xml:space="preserve"> </w:t>
+      </w:r>
+      <w:r>
+        <w:rPr>
+          <w:b/>
+          <w:u w:val="single"/>
+        </w:rPr>
+        <w:t>добавление ‘</w:t>
+      </w:r>
+      <w:r>
+        <w:rPr>
+          <w:b/>
+          <w:u w:val="single"/>
+          <w:lang w:val="en-US"/>
+        </w:rPr>
+        <w:t>Combined</w:t>
+      </w:r>
+      <w:r>
+        <w:rPr>
+          <w:b/>
+          <w:u w:val="single"/>
+        </w:rPr>
+        <w:t xml:space="preserve"> </w:t>
+      </w:r>
+      <w:r>
+        <w:rPr>
+          <w:b/>
+          <w:u w:val="single"/>
+          <w:lang w:val="en-US"/>
+        </w:rPr>
+        <w:t>feature</w:t>
+      </w:r>
+      <w:r>
+        <w:rPr>
+          <w:b/>
+          <w:u w:val="single"/>
+        </w:rPr>
+        <w:t>’</w:t>
+      </w:r>
+      <w:r>
+        <w:t>,</w:t>
+      </w:r>
+      <w:r>
+        <w:t xml:space="preserve"> </w:t>
+      </w:r>
+      <w:r>
+        <w:t>без</w:t>
+      </w:r>
+      <w:r>
+        <w:t xml:space="preserve"> </w:t>
+      </w:r>
+      <w:proofErr w:type="spellStart"/>
+      <w:r>
+        <w:t>гиперпараметров</w:t>
+      </w:r>
+      <w:proofErr w:type="spellEnd"/>
+      <w:r>
+        <w:t xml:space="preserve">. </w:t>
+      </w:r>
+      <w:r>
+        <w:t>(</w:t>
+      </w:r>
+      <w:r>
+        <w:t>7</w:t>
+      </w:r>
+      <w:r>
+        <w:t xml:space="preserve">89, </w:t>
+      </w:r>
+      <w:r>
+        <w:t>12</w:t>
+      </w:r>
+      <w:r>
+        <w:t>)</w:t>
+      </w:r>
+    </w:p>
+    <w:tbl>
+      <w:tblPr>
+        <w:tblStyle w:val="af3"/>
+        <w:tblW w:w="0" w:type="auto"/>
+        <w:tblLook w:val="04A0" w:firstRow="1" w:lastRow="0" w:firstColumn="1" w:lastColumn="0" w:noHBand="0" w:noVBand="1"/>
+      </w:tblPr>
+      <w:tblGrid>
+        <w:gridCol w:w="1316"/>
+        <w:gridCol w:w="1265"/>
+        <w:gridCol w:w="1203"/>
+        <w:gridCol w:w="1198"/>
+        <w:gridCol w:w="1298"/>
+        <w:gridCol w:w="1234"/>
+        <w:gridCol w:w="1141"/>
+        <w:gridCol w:w="1199"/>
+      </w:tblGrid>
+      <w:tr>
+        <w:tc>
+          <w:tcPr>
+            <w:tcW w:w="1316" w:type="dxa"/>
+          </w:tcPr>
+          <w:p>
+            <w:pPr>
+              <w:pStyle w:val="afe"/>
+              <w:ind w:firstLine="0"/>
+              <w:rPr>
+                <w:lang w:val="en-US"/>
+              </w:rPr>
+            </w:pPr>
+            <w:r>
+              <w:t>Модель</w:t>
+            </w:r>
+          </w:p>
+        </w:tc>
+        <w:tc>
+          <w:tcPr>
+            <w:tcW w:w="1265" w:type="dxa"/>
+          </w:tcPr>
+          <w:p>
+            <w:pPr>
+              <w:pStyle w:val="afe"/>
+              <w:ind w:firstLine="0"/>
+              <w:rPr>
+                <w:lang w:val="en-US"/>
+              </w:rPr>
+            </w:pPr>
+            <w:r>
+              <w:rPr>
+                <w:lang w:val="en-US"/>
+              </w:rPr>
+              <w:t>Linear</w:t>
+            </w:r>
+          </w:p>
+        </w:tc>
+        <w:tc>
+          <w:tcPr>
+            <w:tcW w:w="1203" w:type="dxa"/>
+          </w:tcPr>
+          <w:p>
+            <w:pPr>
+              <w:pStyle w:val="afe"/>
+              <w:ind w:firstLine="0"/>
+              <w:rPr>
+                <w:lang w:val="en-US"/>
+              </w:rPr>
+            </w:pPr>
+            <w:r>
+              <w:rPr>
+                <w:lang w:val="en-US"/>
+              </w:rPr>
+              <w:t>DT</w:t>
+            </w:r>
+          </w:p>
+        </w:tc>
+        <w:tc>
+          <w:tcPr>
+            <w:tcW w:w="1198" w:type="dxa"/>
+          </w:tcPr>
+          <w:p>
+            <w:pPr>
+              <w:pStyle w:val="afe"/>
+              <w:ind w:firstLine="0"/>
+              <w:rPr>
+                <w:lang w:val="en-US"/>
+              </w:rPr>
+            </w:pPr>
+            <w:r>
+              <w:rPr>
+                <w:lang w:val="en-US"/>
+              </w:rPr>
+              <w:t>RF</w:t>
+            </w:r>
+          </w:p>
+        </w:tc>
+        <w:tc>
+          <w:tcPr>
+            <w:tcW w:w="1298" w:type="dxa"/>
+          </w:tcPr>
+          <w:p>
+            <w:pPr>
+              <w:pStyle w:val="afe"/>
+              <w:ind w:firstLine="0"/>
+              <w:rPr>
+                <w:lang w:val="en-US"/>
+              </w:rPr>
+            </w:pPr>
+            <w:proofErr w:type="spellStart"/>
+            <w:r>
+              <w:rPr>
+                <w:lang w:val="en-US"/>
+              </w:rPr>
+              <w:t>GBoost</w:t>
+            </w:r>
+            <w:proofErr w:type="spellEnd"/>
+          </w:p>
+        </w:tc>
+        <w:tc>
+          <w:tcPr>
+            <w:tcW w:w="1234" w:type="dxa"/>
+          </w:tcPr>
+          <w:p>
+            <w:pPr>
+              <w:pStyle w:val="afe"/>
+              <w:ind w:firstLine="0"/>
+              <w:rPr>
+                <w:lang w:val="en-US"/>
+              </w:rPr>
+            </w:pPr>
+            <w:r>
+              <w:rPr>
+                <w:lang w:val="en-US"/>
+              </w:rPr>
+              <w:t>KNN</w:t>
+            </w:r>
+          </w:p>
+        </w:tc>
+        <w:tc>
+          <w:tcPr>
+            <w:tcW w:w="1141" w:type="dxa"/>
+          </w:tcPr>
+          <w:p>
+            <w:pPr>
+              <w:pStyle w:val="afe"/>
+              <w:ind w:firstLine="0"/>
+              <w:rPr>
+                <w:lang w:val="en-US"/>
+              </w:rPr>
+            </w:pPr>
+            <w:proofErr w:type="spellStart"/>
+            <w:r>
+              <w:rPr>
+                <w:lang w:val="en-US"/>
+              </w:rPr>
+              <w:t>Catboost</w:t>
+            </w:r>
+            <w:proofErr w:type="spellEnd"/>
+          </w:p>
+        </w:tc>
+        <w:tc>
+          <w:tcPr>
+            <w:tcW w:w="1199" w:type="dxa"/>
+          </w:tcPr>
+          <w:p>
+            <w:pPr>
+              <w:pStyle w:val="afe"/>
+              <w:ind w:firstLine="0"/>
+              <w:rPr>
+                <w:lang w:val="en-US"/>
+              </w:rPr>
+            </w:pPr>
+            <w:proofErr w:type="spellStart"/>
+            <w:r>
+              <w:rPr>
+                <w:lang w:val="en-US"/>
+              </w:rPr>
+              <w:t>XGBoost</w:t>
+            </w:r>
+            <w:proofErr w:type="spellEnd"/>
+          </w:p>
+        </w:tc>
+      </w:tr>
+      <w:tr>
+        <w:tc>
+          <w:tcPr>
+            <w:tcW w:w="1316" w:type="dxa"/>
+          </w:tcPr>
+          <w:p>
+            <w:pPr>
+              <w:pStyle w:val="afe"/>
+              <w:ind w:firstLine="0"/>
+              <w:rPr>
+                <w:lang w:val="en-US"/>
+              </w:rPr>
+            </w:pPr>
+            <w:r>
+              <w:rPr>
+                <w:lang w:val="en-US"/>
+              </w:rPr>
+              <w:t>R</w:t>
+            </w:r>
+            <w:r>
+              <w:rPr>
+                <w:vertAlign w:val="superscript"/>
+                <w:lang w:val="en-US"/>
+              </w:rPr>
+              <w:t>2</w:t>
+            </w:r>
+            <w:r>
+              <w:rPr>
+                <w:lang w:val="en-US"/>
+              </w:rPr>
+              <w:t xml:space="preserve"> (t</w:t>
+            </w:r>
+            <w:r>
+              <w:rPr>
+                <w:lang w:val="en-US"/>
+              </w:rPr>
+              <w:t>rain</w:t>
+            </w:r>
+            <w:r>
+              <w:rPr>
+                <w:lang w:val="en-US"/>
+              </w:rPr>
+              <w:t>)</w:t>
+            </w:r>
+          </w:p>
+        </w:tc>
+        <w:tc>
+          <w:tcPr>
+            <w:tcW w:w="1265" w:type="dxa"/>
+          </w:tcPr>
+          <w:p>
+            <w:pPr>
+              <w:pStyle w:val="afe"/>
+              <w:ind w:firstLine="0"/>
+              <w:rPr>
+                <w:lang w:val="en-US"/>
+              </w:rPr>
+            </w:pPr>
+            <w:r>
+              <w:rPr>
+                <w:lang w:val="en-US"/>
+              </w:rPr>
+              <w:t>0.58</w:t>
+            </w:r>
+          </w:p>
+        </w:tc>
+        <w:tc>
+          <w:tcPr>
+            <w:tcW w:w="1203" w:type="dxa"/>
+          </w:tcPr>
+          <w:p>
+            <w:pPr>
+              <w:pStyle w:val="afe"/>
+              <w:ind w:firstLine="0"/>
+              <w:rPr>
+                <w:lang w:val="en-US"/>
+              </w:rPr>
+            </w:pPr>
+            <w:r>
+              <w:rPr>
+                <w:lang w:val="en-US"/>
+              </w:rPr>
+              <w:t>1</w:t>
+            </w:r>
+          </w:p>
+        </w:tc>
+        <w:tc>
+          <w:tcPr>
+            <w:tcW w:w="1198" w:type="dxa"/>
+          </w:tcPr>
+          <w:p>
+            <w:pPr>
+              <w:pStyle w:val="afe"/>
+              <w:ind w:firstLine="0"/>
+              <w:rPr>
+                <w:lang w:val="en-US"/>
+              </w:rPr>
+            </w:pPr>
+            <w:r>
+              <w:rPr>
+                <w:lang w:val="en-US"/>
+              </w:rPr>
+              <w:t>0.49</w:t>
+            </w:r>
+          </w:p>
+        </w:tc>
+        <w:tc>
+          <w:tcPr>
+            <w:tcW w:w="1298" w:type="dxa"/>
+          </w:tcPr>
+          <w:p>
+            <w:pPr>
+              <w:pStyle w:val="afe"/>
+              <w:ind w:firstLine="0"/>
+              <w:rPr>
+                <w:lang w:val="en-US"/>
+              </w:rPr>
+            </w:pPr>
+            <w:r>
+              <w:rPr>
+                <w:lang w:val="en-US"/>
+              </w:rPr>
+              <w:t>0.92</w:t>
+            </w:r>
+          </w:p>
+        </w:tc>
+        <w:tc>
+          <w:tcPr>
+            <w:tcW w:w="1234" w:type="dxa"/>
+          </w:tcPr>
+          <w:p>
+            <w:pPr>
+              <w:pStyle w:val="afe"/>
+              <w:ind w:firstLine="0"/>
+              <w:rPr>
+                <w:lang w:val="en-US"/>
+              </w:rPr>
+            </w:pPr>
+            <w:r>
+              <w:rPr>
+                <w:lang w:val="en-US"/>
+              </w:rPr>
+              <w:t>0.53</w:t>
+            </w:r>
+          </w:p>
+        </w:tc>
+        <w:tc>
+          <w:tcPr>
+            <w:tcW w:w="1141" w:type="dxa"/>
+          </w:tcPr>
+          <w:p>
+            <w:pPr>
+              <w:pStyle w:val="afe"/>
+              <w:ind w:firstLine="0"/>
+              <w:rPr>
+                <w:lang w:val="en-US"/>
+              </w:rPr>
+            </w:pPr>
+            <w:r>
+              <w:rPr>
+                <w:lang w:val="en-US"/>
+              </w:rPr>
+              <w:t>0.93</w:t>
+            </w:r>
+          </w:p>
+        </w:tc>
+        <w:tc>
+          <w:tcPr>
+            <w:tcW w:w="1199" w:type="dxa"/>
+          </w:tcPr>
+          <w:p>
+            <w:pPr>
+              <w:pStyle w:val="afe"/>
+              <w:ind w:firstLine="0"/>
+              <w:rPr>
+                <w:lang w:val="en-US"/>
+              </w:rPr>
+            </w:pPr>
+            <w:r>
+              <w:rPr>
+                <w:lang w:val="en-US"/>
+              </w:rPr>
+              <w:t>0.94</w:t>
+            </w:r>
+          </w:p>
+        </w:tc>
+        <w:bookmarkStart w:id="11" w:name="_GoBack"/>
+        <w:bookmarkEnd w:id="11"/>
+      </w:tr>
+      <w:tr>
+        <w:tc>
+          <w:tcPr>
+            <w:tcW w:w="1316" w:type="dxa"/>
+          </w:tcPr>
+          <w:p>
+            <w:pPr>
+              <w:pStyle w:val="afe"/>
+              <w:ind w:firstLine="0"/>
+              <w:rPr>
+                <w:lang w:val="en-US"/>
+              </w:rPr>
+            </w:pPr>
+            <w:r>
+              <w:rPr>
+                <w:lang w:val="en-US"/>
+              </w:rPr>
+              <w:t>R</w:t>
+            </w:r>
+            <w:r>
+              <w:rPr>
+                <w:vertAlign w:val="superscript"/>
+              </w:rPr>
+              <w:t>2</w:t>
+            </w:r>
+            <w:r>
+              <w:rPr>
+                <w:lang w:val="en-US"/>
+              </w:rPr>
+              <w:t xml:space="preserve"> (test)</w:t>
+            </w:r>
+          </w:p>
+        </w:tc>
+        <w:tc>
+          <w:tcPr>
+            <w:tcW w:w="1265" w:type="dxa"/>
+          </w:tcPr>
+          <w:p>
+            <w:pPr>
+              <w:pStyle w:val="afe"/>
+              <w:ind w:firstLine="0"/>
+              <w:rPr>
+                <w:lang w:val="en-US"/>
+              </w:rPr>
+            </w:pPr>
+            <w:r>
+              <w:rPr>
+                <w:lang w:val="en-US"/>
+              </w:rPr>
+              <w:t>0.33</w:t>
+            </w:r>
+          </w:p>
+        </w:tc>
+        <w:tc>
+          <w:tcPr>
+            <w:tcW w:w="1203" w:type="dxa"/>
+          </w:tcPr>
+          <w:p>
+            <w:pPr>
+              <w:pStyle w:val="afe"/>
+              <w:ind w:firstLine="0"/>
+              <w:rPr>
+                <w:lang w:val="en-US"/>
+              </w:rPr>
+            </w:pPr>
+            <w:r>
+              <w:rPr>
+                <w:lang w:val="en-US"/>
+              </w:rPr>
+              <w:t>0.55</w:t>
+            </w:r>
+          </w:p>
+        </w:tc>
+        <w:tc>
+          <w:tcPr>
+            <w:tcW w:w="1198" w:type="dxa"/>
+          </w:tcPr>
+          <w:p>
+            <w:pPr>
+              <w:pStyle w:val="afe"/>
+              <w:ind w:firstLine="0"/>
+              <w:rPr>
+                <w:lang w:val="en-US"/>
+              </w:rPr>
+            </w:pPr>
+            <w:r>
+              <w:rPr>
+                <w:lang w:val="en-US"/>
+              </w:rPr>
+              <w:t>0.41</w:t>
+            </w:r>
+          </w:p>
+        </w:tc>
+        <w:tc>
+          <w:tcPr>
+            <w:tcW w:w="1298" w:type="dxa"/>
+          </w:tcPr>
+          <w:p>
+            <w:pPr>
+              <w:pStyle w:val="afe"/>
+              <w:ind w:firstLine="0"/>
+              <w:rPr>
+                <w:lang w:val="en-US"/>
+              </w:rPr>
+            </w:pPr>
+            <w:r>
+              <w:rPr>
+                <w:lang w:val="en-US"/>
+              </w:rPr>
+              <w:t>0.69</w:t>
+            </w:r>
+          </w:p>
+        </w:tc>
+        <w:tc>
+          <w:tcPr>
+            <w:tcW w:w="1234" w:type="dxa"/>
+          </w:tcPr>
+          <w:p>
+            <w:pPr>
+              <w:pStyle w:val="afe"/>
+              <w:ind w:firstLine="0"/>
+              <w:rPr>
+                <w:lang w:val="en-US"/>
+              </w:rPr>
+            </w:pPr>
+            <w:r>
+              <w:rPr>
+                <w:lang w:val="en-US"/>
+              </w:rPr>
+              <w:t>0.46</w:t>
+            </w:r>
+          </w:p>
+        </w:tc>
+        <w:tc>
+          <w:tcPr>
+            <w:tcW w:w="1141" w:type="dxa"/>
+          </w:tcPr>
+          <w:p>
+            <w:pPr>
+              <w:pStyle w:val="afe"/>
+              <w:ind w:firstLine="0"/>
+              <w:rPr>
+                <w:lang w:val="en-US"/>
+              </w:rPr>
+            </w:pPr>
+            <w:r>
+              <w:rPr>
+                <w:lang w:val="en-US"/>
+              </w:rPr>
+              <w:t>0.70</w:t>
+            </w:r>
+          </w:p>
+        </w:tc>
+        <w:tc>
+          <w:tcPr>
+            <w:tcW w:w="1199" w:type="dxa"/>
+          </w:tcPr>
+          <w:p>
+            <w:pPr>
+              <w:pStyle w:val="afe"/>
+              <w:ind w:firstLine="0"/>
+              <w:rPr>
+                <w:lang w:val="en-US"/>
+              </w:rPr>
+            </w:pPr>
+            <w:r>
+              <w:rPr>
+                <w:lang w:val="en-US"/>
+              </w:rPr>
+              <w:t>0.71</w:t>
+            </w:r>
+          </w:p>
+        </w:tc>
+      </w:tr>
+      <w:tr>
+        <w:tc>
+          <w:tcPr>
+            <w:tcW w:w="1316" w:type="dxa"/>
+          </w:tcPr>
+          <w:p>
+            <w:pPr>
+              <w:pStyle w:val="afe"/>
+              <w:ind w:firstLine="0"/>
+              <w:rPr>
+                <w:lang w:val="en-US"/>
+              </w:rPr>
+            </w:pPr>
+            <w:r>
+              <w:rPr>
+                <w:lang w:val="en-US"/>
+              </w:rPr>
+              <w:t>RMSE</w:t>
+            </w:r>
+          </w:p>
+        </w:tc>
+        <w:tc>
+          <w:tcPr>
+            <w:tcW w:w="1265" w:type="dxa"/>
+          </w:tcPr>
+          <w:p>
+            <w:pPr>
+              <w:pStyle w:val="afe"/>
+              <w:ind w:firstLine="0"/>
+              <w:rPr>
+                <w:lang w:val="en-US"/>
+              </w:rPr>
+            </w:pPr>
+            <w:r>
+              <w:rPr>
+                <w:lang w:val="en-US"/>
+              </w:rPr>
+              <w:t>2.58</w:t>
+            </w:r>
+          </w:p>
+        </w:tc>
+        <w:tc>
+          <w:tcPr>
+            <w:tcW w:w="1203" w:type="dxa"/>
+          </w:tcPr>
+          <w:p>
+            <w:pPr>
+              <w:pStyle w:val="afe"/>
+              <w:ind w:firstLine="0"/>
+              <w:rPr>
+                <w:lang w:val="en-US"/>
+              </w:rPr>
+            </w:pPr>
+            <w:r>
+              <w:rPr>
+                <w:lang w:val="en-US"/>
+              </w:rPr>
+              <w:t>2.11</w:t>
+            </w:r>
+          </w:p>
+        </w:tc>
+        <w:tc>
+          <w:tcPr>
+            <w:tcW w:w="1198" w:type="dxa"/>
+          </w:tcPr>
+          <w:p>
+            <w:pPr>
+              <w:pStyle w:val="afe"/>
+              <w:ind w:firstLine="0"/>
+              <w:rPr>
+                <w:lang w:val="en-US"/>
+              </w:rPr>
+            </w:pPr>
+            <w:r>
+              <w:rPr>
+                <w:lang w:val="en-US"/>
+              </w:rPr>
+              <w:t>2.43</w:t>
+            </w:r>
+          </w:p>
+        </w:tc>
+        <w:tc>
+          <w:tcPr>
+            <w:tcW w:w="1298" w:type="dxa"/>
+          </w:tcPr>
+          <w:p>
+            <w:pPr>
+              <w:pStyle w:val="afe"/>
+              <w:ind w:firstLine="0"/>
+              <w:rPr>
+                <w:lang w:val="en-US"/>
+              </w:rPr>
+            </w:pPr>
+            <w:r>
+              <w:rPr>
+                <w:lang w:val="en-US"/>
+              </w:rPr>
+              <w:t>1.75</w:t>
+            </w:r>
+          </w:p>
+        </w:tc>
+        <w:tc>
+          <w:tcPr>
+            <w:tcW w:w="1234" w:type="dxa"/>
+          </w:tcPr>
+          <w:p>
+            <w:pPr>
+              <w:pStyle w:val="afe"/>
+              <w:ind w:firstLine="0"/>
+              <w:rPr>
+                <w:lang w:val="en-US"/>
+              </w:rPr>
+            </w:pPr>
+            <w:r>
+              <w:rPr>
+                <w:lang w:val="en-US"/>
+              </w:rPr>
+              <w:t>2.32</w:t>
+            </w:r>
+          </w:p>
+        </w:tc>
+        <w:tc>
+          <w:tcPr>
+            <w:tcW w:w="1141" w:type="dxa"/>
+          </w:tcPr>
+          <w:p>
+            <w:pPr>
+              <w:pStyle w:val="afe"/>
+              <w:ind w:firstLine="0"/>
+              <w:rPr>
+                <w:lang w:val="en-US"/>
+              </w:rPr>
+            </w:pPr>
+            <w:r>
+              <w:rPr>
+                <w:lang w:val="en-US"/>
+              </w:rPr>
+              <w:t>1.73</w:t>
+            </w:r>
+          </w:p>
+        </w:tc>
+        <w:tc>
+          <w:tcPr>
+            <w:tcW w:w="1199" w:type="dxa"/>
+          </w:tcPr>
+          <w:p>
+            <w:pPr>
+              <w:pStyle w:val="afe"/>
+              <w:ind w:firstLine="0"/>
+              <w:rPr>
+                <w:lang w:val="en-US"/>
+              </w:rPr>
+            </w:pPr>
+            <w:r>
+              <w:rPr>
+                <w:lang w:val="en-US"/>
+              </w:rPr>
+              <w:t>1.72</w:t>
+            </w:r>
+          </w:p>
+        </w:tc>
+      </w:tr>
+    </w:tbl>
+    <w:p/>
+    <w:p>
+      <w:pPr>
+        <w:rPr>
+          <w:lang w:val="en-US"/>
+        </w:rPr>
+      </w:pPr>
     </w:p>
     <w:p>
-      <w:r>
+      <w:pPr>
         <w:rPr>
           <w:lang w:val="en-US"/>
         </w:rPr>
-        <w:t>Noisy data</w:t>
-      </w:r>
+      </w:pPr>
     </w:p>
     <w:p>
       <w:pPr>
@@ -15064,7 +18692,7 @@
         <w:rPr>
           <w:lang w:val="en-US"/>
         </w:rPr>
-        <w:t>Irrelevant features</w:t>
+        <w:t>Small dataset</w:t>
       </w:r>
     </w:p>
     <w:p>
@@ -15077,7 +18705,7 @@
         <w:rPr>
           <w:lang w:val="en-US"/>
         </w:rPr>
-        <w:t>Complex models such as deep neural networks can detect subtle patterns in the data,</w:t>
+        <w:t>Noisy data</w:t>
       </w:r>
     </w:p>
     <w:p>
@@ -15086,19 +18714,11 @@
           <w:lang w:val="en-US"/>
         </w:rPr>
       </w:pPr>
-      <w:proofErr w:type="gramStart"/>
       <w:r>
         <w:rPr>
           <w:lang w:val="en-US"/>
         </w:rPr>
-        <w:t>but</w:t>
-      </w:r>
-      <w:proofErr w:type="gramEnd"/>
-      <w:r>
-        <w:rPr>
-          <w:lang w:val="en-US"/>
-        </w:rPr>
-        <w:t xml:space="preserve"> if the training set is noisy, or if it is too small (which introduces sampling noise),</w:t>
+        <w:t>Irrelevant features</w:t>
       </w:r>
     </w:p>
     <w:p>
@@ -15107,11 +18727,46 @@
           <w:lang w:val="en-US"/>
         </w:rPr>
       </w:pPr>
+      <w:r>
+        <w:rPr>
+          <w:lang w:val="en-US"/>
+        </w:rPr>
+        <w:t>Complex models such as deep neural networks can detect subtle patterns in the data,</w:t>
+      </w:r>
+    </w:p>
+    <w:p>
+      <w:pPr>
+        <w:rPr>
+          <w:lang w:val="en-US"/>
+        </w:rPr>
+      </w:pPr>
       <w:proofErr w:type="gramStart"/>
       <w:r>
         <w:rPr>
           <w:lang w:val="en-US"/>
         </w:rPr>
+        <w:t>but</w:t>
+      </w:r>
+      <w:proofErr w:type="gramEnd"/>
+      <w:r>
+        <w:rPr>
+          <w:lang w:val="en-US"/>
+        </w:rPr>
+        <w:t xml:space="preserve"> if the training set is noisy, or if it is too small (which introduces sampling noise),</w:t>
+      </w:r>
+    </w:p>
+    <w:p>
+      <w:pPr>
+        <w:rPr>
+          <w:lang w:val="en-US"/>
+        </w:rPr>
+      </w:pPr>
+      <w:proofErr w:type="gramStart"/>
+      <w:r>
+        <w:rPr>
+          <w:lang w:val="en-US"/>
+        </w:rPr>
+        <w:lastRenderedPageBreak/>
         <w:t>then</w:t>
       </w:r>
       <w:proofErr w:type="gramEnd"/>
@@ -15597,7 +19252,7 @@
             <w:sz w:val="26"/>
             <w:szCs w:val="26"/>
           </w:rPr>
-          <w:t>17</w:t>
+          <w:t>20</w:t>
         </w:r>
         <w:r>
           <w:rPr>
@@ -18906,7 +22561,7 @@
   <w:style w:type="paragraph" w:default="1" w:styleId="a0">
     <w:name w:val="Normal"/>
     <w:qFormat/>
-    <w:rsid w:val="00B12E6E"/>
+    <w:rsid w:val="005A70AC"/>
   </w:style>
   <w:style w:type="paragraph" w:styleId="1">
     <w:name w:val="heading 1"/>
@@ -20751,7 +24406,7 @@
   <w:style w:type="paragraph" w:default="1" w:styleId="a0">
     <w:name w:val="Normal"/>
     <w:qFormat/>
-    <w:rsid w:val="00B12E6E"/>
+    <w:rsid w:val="005A70AC"/>
   </w:style>
   <w:style w:type="paragraph" w:styleId="1">
     <w:name w:val="heading 1"/>
@@ -22731,7 +26386,7 @@
 </file>
 
 <file path=customXml/itemProps1.xml><?xml version="1.0" encoding="utf-8"?>
-<ds:datastoreItem xmlns:ds="http://schemas.openxmlformats.org/officeDocument/2006/customXml" ds:itemID="{C5FD448C-0457-4095-97F2-E02567C6F77D}">
+<ds:datastoreItem xmlns:ds="http://schemas.openxmlformats.org/officeDocument/2006/customXml" ds:itemID="{4DFEC02C-9EEC-4DF4-ABA7-4F2FDEBF0333}">
   <ds:schemaRefs>
     <ds:schemaRef ds:uri="http://schemas.openxmlformats.org/officeDocument/2006/bibliography"/>
   </ds:schemaRefs>

</xml_diff>